<commit_message>
Remove name/class/date line to match the original worksheet
Co-Authored-By: Claude Opus 5.5 <noreply@anthropic.com>
Claude-Session: https://claude.ai/code/session_01GpmMkoJqENNuTTU6MYzvCq
</commit_message>
<xml_diff>
--- a/arabic-worksheets/مرحلة-التركيب-الميم-الراء.docx
+++ b/arabic-worksheets/مرحلة-التركيب-الميم-الراء.docx
@@ -63,73 +63,8 @@
     </w:tbl>
     <w:p>
       <w:pPr>
-        <w:bidi/>
-        <w:spacing w:after="60" w:before="80" w:line="360" w:lineRule="auto"/>
-        <w:jc w:val="center"/>
+        <w:spacing w:after="0" w:before="0" w:line="280" w:lineRule="exact"/>
       </w:pPr>
-      <w:r>
-        <w:rPr>
-          <w:rFonts w:ascii="Amiri" w:cs="Amiri" w:eastAsia="Amiri" w:hAnsi="Amiri"/>
-          <w:b/>
-          <w:bCs/>
-          <w:sz w:val="26"/>
-          <w:szCs w:val="26"/>
-          <w:rtl/>
-        </w:rPr>
-        <w:t xml:space="preserve">الِاسْمُ: </w:t>
-      </w:r>
-      <w:r>
-        <w:rPr>
-          <w:rFonts w:ascii="Amiri" w:cs="Amiri" w:eastAsia="Amiri" w:hAnsi="Amiri"/>
-          <w:color w:val="808080"/>
-          <w:sz w:val="32"/>
-          <w:szCs w:val="32"/>
-          <w:rtl/>
-        </w:rPr>
-        <w:t xml:space="preserve">..................................</w:t>
-      </w:r>
-      <w:r>
-        <w:rPr>
-          <w:rFonts w:ascii="Amiri" w:cs="Amiri" w:eastAsia="Amiri" w:hAnsi="Amiri"/>
-          <w:b/>
-          <w:bCs/>
-          <w:sz w:val="26"/>
-          <w:szCs w:val="26"/>
-          <w:rtl/>
-        </w:rPr>
-        <w:t xml:space="preserve">    الْقِسْمُ: </w:t>
-      </w:r>
-      <w:r>
-        <w:rPr>
-          <w:rFonts w:ascii="Amiri" w:cs="Amiri" w:eastAsia="Amiri" w:hAnsi="Amiri"/>
-          <w:color w:val="808080"/>
-          <w:sz w:val="32"/>
-          <w:szCs w:val="32"/>
-          <w:rtl/>
-        </w:rPr>
-        <w:t xml:space="preserve">..................</w:t>
-      </w:r>
-      <w:r>
-        <w:rPr>
-          <w:rFonts w:ascii="Amiri" w:cs="Amiri" w:eastAsia="Amiri" w:hAnsi="Amiri"/>
-          <w:b/>
-          <w:bCs/>
-          <w:sz w:val="26"/>
-          <w:szCs w:val="26"/>
-          <w:rtl/>
-        </w:rPr>
-        <w:t xml:space="preserve">    التَّارِيخُ: </w:t>
-      </w:r>
-      <w:r>
-        <w:rPr>
-          <w:rFonts w:ascii="Amiri" w:cs="Amiri" w:eastAsia="Amiri" w:hAnsi="Amiri"/>
-          <w:color w:val="808080"/>
-          <w:sz w:val="32"/>
-          <w:szCs w:val="32"/>
-          <w:rtl/>
-        </w:rPr>
-        <w:t xml:space="preserve">..................</w:t>
-      </w:r>
     </w:p>
     <w:tbl>
       <w:tblPr>
@@ -2787,73 +2722,8 @@
     </w:tbl>
     <w:p>
       <w:pPr>
-        <w:bidi/>
-        <w:spacing w:after="60" w:before="80" w:line="360" w:lineRule="auto"/>
-        <w:jc w:val="center"/>
+        <w:spacing w:after="0" w:before="0" w:line="280" w:lineRule="exact"/>
       </w:pPr>
-      <w:r>
-        <w:rPr>
-          <w:rFonts w:ascii="Amiri" w:cs="Amiri" w:eastAsia="Amiri" w:hAnsi="Amiri"/>
-          <w:b/>
-          <w:bCs/>
-          <w:sz w:val="26"/>
-          <w:szCs w:val="26"/>
-          <w:rtl/>
-        </w:rPr>
-        <w:t xml:space="preserve">الِاسْمُ: </w:t>
-      </w:r>
-      <w:r>
-        <w:rPr>
-          <w:rFonts w:ascii="Amiri" w:cs="Amiri" w:eastAsia="Amiri" w:hAnsi="Amiri"/>
-          <w:color w:val="808080"/>
-          <w:sz w:val="32"/>
-          <w:szCs w:val="32"/>
-          <w:rtl/>
-        </w:rPr>
-        <w:t xml:space="preserve">..................................</w:t>
-      </w:r>
-      <w:r>
-        <w:rPr>
-          <w:rFonts w:ascii="Amiri" w:cs="Amiri" w:eastAsia="Amiri" w:hAnsi="Amiri"/>
-          <w:b/>
-          <w:bCs/>
-          <w:sz w:val="26"/>
-          <w:szCs w:val="26"/>
-          <w:rtl/>
-        </w:rPr>
-        <w:t xml:space="preserve">    الْقِسْمُ: </w:t>
-      </w:r>
-      <w:r>
-        <w:rPr>
-          <w:rFonts w:ascii="Amiri" w:cs="Amiri" w:eastAsia="Amiri" w:hAnsi="Amiri"/>
-          <w:color w:val="808080"/>
-          <w:sz w:val="32"/>
-          <w:szCs w:val="32"/>
-          <w:rtl/>
-        </w:rPr>
-        <w:t xml:space="preserve">..................</w:t>
-      </w:r>
-      <w:r>
-        <w:rPr>
-          <w:rFonts w:ascii="Amiri" w:cs="Amiri" w:eastAsia="Amiri" w:hAnsi="Amiri"/>
-          <w:b/>
-          <w:bCs/>
-          <w:sz w:val="26"/>
-          <w:szCs w:val="26"/>
-          <w:rtl/>
-        </w:rPr>
-        <w:t xml:space="preserve">    التَّارِيخُ: </w:t>
-      </w:r>
-      <w:r>
-        <w:rPr>
-          <w:rFonts w:ascii="Amiri" w:cs="Amiri" w:eastAsia="Amiri" w:hAnsi="Amiri"/>
-          <w:color w:val="808080"/>
-          <w:sz w:val="32"/>
-          <w:szCs w:val="32"/>
-          <w:rtl/>
-        </w:rPr>
-        <w:t xml:space="preserve">..................</w:t>
-      </w:r>
     </w:p>
     <w:tbl>
       <w:tblPr>

</xml_diff>

<commit_message>
Use copybook-ruled writing boxes for all answer spaces
Replaces the dotted blanks with ruled boxes (pale background, guide
lines with a darker baseline, vertical cells) like the original sheet.

Co-Authored-By: Claude Opus 5.5 <noreply@anthropic.com>
Claude-Session: https://claude.ai/code/session_01GpmMkoJqENNuTTU6MYzvCq
</commit_message>
<xml_diff>
--- a/arabic-worksheets/مرحلة-التركيب-الميم-الراء.docx
+++ b/arabic-worksheets/مرحلة-التركيب-الميم-الراء.docx
@@ -450,11 +450,12 @@
           <w:p>
             <w:pPr>
               <w:bidi/>
-              <w:spacing w:after="20" w:before="180" w:line="400" w:lineRule="auto"/>
+              <w:spacing w:after="40" w:before="160" w:line="300" w:lineRule="auto"/>
             </w:pPr>
             <w:r>
               <w:rPr>
                 <w:rFonts w:ascii="Amiri" w:cs="Amiri" w:eastAsia="Amiri" w:hAnsi="Amiri"/>
+                <w:position w:val="15"/>
                 <w:sz w:val="44"/>
                 <w:szCs w:val="44"/>
                 <w:rtl/>
@@ -462,18 +463,49 @@
               <w:t xml:space="preserve">وَقَفَتِ الْـ</w:t>
             </w:r>
             <w:r>
-              <w:rPr>
-                <w:rFonts w:ascii="Amiri" w:cs="Amiri" w:eastAsia="Amiri" w:hAnsi="Amiri"/>
-                <w:color w:val="808080"/>
-                <w:sz w:val="32"/>
-                <w:szCs w:val="32"/>
-                <w:rtl/>
-              </w:rPr>
-              <w:t xml:space="preserve">................</w:t>
+              <w:drawing>
+                <wp:inline distT="0" distB="0" distL="0" distR="0">
+                  <wp:extent cx="723900" cy="400050"/>
+                  <wp:effectExtent t="0" r="0" b="0" l="0"/>
+                  <wp:docPr id="1" name="" descr="" title=""/>
+                  <wp:cNvGraphicFramePr>
+                    <a:graphicFrameLocks xmlns:a="http://schemas.openxmlformats.org/drawingml/2006/main" noChangeAspect="1"/>
+                  </wp:cNvGraphicFramePr>
+                  <a:graphic xmlns:a="http://schemas.openxmlformats.org/drawingml/2006/main">
+                    <a:graphicData uri="http://schemas.openxmlformats.org/drawingml/2006/picture">
+                      <pic:pic xmlns:pic="http://schemas.openxmlformats.org/drawingml/2006/picture">
+                        <pic:nvPicPr>
+                          <pic:cNvPr id="0" name="" descr=""/>
+                          <pic:cNvPicPr>
+                            <a:picLocks noChangeAspect="1" noChangeArrowheads="1"/>
+                          </pic:cNvPicPr>
+                        </pic:nvPicPr>
+                        <pic:blipFill>
+                          <a:blip r:embed="rId7" cstate="none"/>
+                          <a:srcRect/>
+                          <a:stretch>
+                            <a:fillRect/>
+                          </a:stretch>
+                        </pic:blipFill>
+                        <pic:spPr bwMode="auto">
+                          <a:xfrm>
+                            <a:off x="0" y="0"/>
+                            <a:ext cx="723900" cy="400050"/>
+                          </a:xfrm>
+                          <a:prstGeom prst="rect">
+                            <a:avLst/>
+                          </a:prstGeom>
+                        </pic:spPr>
+                      </pic:pic>
+                    </a:graphicData>
+                  </a:graphic>
+                </wp:inline>
+              </w:drawing>
             </w:r>
             <w:r>
               <w:rPr>
                 <w:rFonts w:ascii="Amiri" w:cs="Amiri" w:eastAsia="Amiri" w:hAnsi="Amiri"/>
+                <w:position w:val="15"/>
                 <w:sz w:val="44"/>
                 <w:szCs w:val="44"/>
                 <w:rtl/>
@@ -481,18 +513,49 @@
               <w:t xml:space="preserve">ـعَلِّمَةُ أَ</w:t>
             </w:r>
             <w:r>
-              <w:rPr>
-                <w:rFonts w:ascii="Amiri" w:cs="Amiri" w:eastAsia="Amiri" w:hAnsi="Amiri"/>
-                <w:color w:val="808080"/>
-                <w:sz w:val="32"/>
-                <w:szCs w:val="32"/>
-                <w:rtl/>
-              </w:rPr>
-              <w:t xml:space="preserve">................</w:t>
+              <w:drawing>
+                <wp:inline distT="0" distB="0" distL="0" distR="0">
+                  <wp:extent cx="723900" cy="400050"/>
+                  <wp:effectExtent t="0" r="0" b="0" l="0"/>
+                  <wp:docPr id="1" name="" descr="" title=""/>
+                  <wp:cNvGraphicFramePr>
+                    <a:graphicFrameLocks xmlns:a="http://schemas.openxmlformats.org/drawingml/2006/main" noChangeAspect="1"/>
+                  </wp:cNvGraphicFramePr>
+                  <a:graphic xmlns:a="http://schemas.openxmlformats.org/drawingml/2006/main">
+                    <a:graphicData uri="http://schemas.openxmlformats.org/drawingml/2006/picture">
+                      <pic:pic xmlns:pic="http://schemas.openxmlformats.org/drawingml/2006/picture">
+                        <pic:nvPicPr>
+                          <pic:cNvPr id="0" name="" descr=""/>
+                          <pic:cNvPicPr>
+                            <a:picLocks noChangeAspect="1" noChangeArrowheads="1"/>
+                          </pic:cNvPicPr>
+                        </pic:nvPicPr>
+                        <pic:blipFill>
+                          <a:blip r:embed="rId7" cstate="none"/>
+                          <a:srcRect/>
+                          <a:stretch>
+                            <a:fillRect/>
+                          </a:stretch>
+                        </pic:blipFill>
+                        <pic:spPr bwMode="auto">
+                          <a:xfrm>
+                            <a:off x="0" y="0"/>
+                            <a:ext cx="723900" cy="400050"/>
+                          </a:xfrm>
+                          <a:prstGeom prst="rect">
+                            <a:avLst/>
+                          </a:prstGeom>
+                        </pic:spPr>
+                      </pic:pic>
+                    </a:graphicData>
+                  </a:graphic>
+                </wp:inline>
+              </w:drawing>
             </w:r>
             <w:r>
               <w:rPr>
                 <w:rFonts w:ascii="Amiri" w:cs="Amiri" w:eastAsia="Amiri" w:hAnsi="Amiri"/>
+                <w:position w:val="15"/>
                 <w:sz w:val="44"/>
                 <w:szCs w:val="44"/>
                 <w:rtl/>
@@ -500,18 +563,49 @@
               <w:t xml:space="preserve">مَ الْقِسْـ</w:t>
             </w:r>
             <w:r>
-              <w:rPr>
-                <w:rFonts w:ascii="Amiri" w:cs="Amiri" w:eastAsia="Amiri" w:hAnsi="Amiri"/>
-                <w:color w:val="808080"/>
-                <w:sz w:val="32"/>
-                <w:szCs w:val="32"/>
-                <w:rtl/>
-              </w:rPr>
-              <w:t xml:space="preserve">................</w:t>
+              <w:drawing>
+                <wp:inline distT="0" distB="0" distL="0" distR="0">
+                  <wp:extent cx="723900" cy="400050"/>
+                  <wp:effectExtent t="0" r="0" b="0" l="0"/>
+                  <wp:docPr id="1" name="" descr="" title=""/>
+                  <wp:cNvGraphicFramePr>
+                    <a:graphicFrameLocks xmlns:a="http://schemas.openxmlformats.org/drawingml/2006/main" noChangeAspect="1"/>
+                  </wp:cNvGraphicFramePr>
+                  <a:graphic xmlns:a="http://schemas.openxmlformats.org/drawingml/2006/main">
+                    <a:graphicData uri="http://schemas.openxmlformats.org/drawingml/2006/picture">
+                      <pic:pic xmlns:pic="http://schemas.openxmlformats.org/drawingml/2006/picture">
+                        <pic:nvPicPr>
+                          <pic:cNvPr id="0" name="" descr=""/>
+                          <pic:cNvPicPr>
+                            <a:picLocks noChangeAspect="1" noChangeArrowheads="1"/>
+                          </pic:cNvPicPr>
+                        </pic:nvPicPr>
+                        <pic:blipFill>
+                          <a:blip r:embed="rId7" cstate="none"/>
+                          <a:srcRect/>
+                          <a:stretch>
+                            <a:fillRect/>
+                          </a:stretch>
+                        </pic:blipFill>
+                        <pic:spPr bwMode="auto">
+                          <a:xfrm>
+                            <a:off x="0" y="0"/>
+                            <a:ext cx="723900" cy="400050"/>
+                          </a:xfrm>
+                          <a:prstGeom prst="rect">
+                            <a:avLst/>
+                          </a:prstGeom>
+                        </pic:spPr>
+                      </pic:pic>
+                    </a:graphicData>
+                  </a:graphic>
+                </wp:inline>
+              </w:drawing>
             </w:r>
             <w:r>
               <w:rPr>
                 <w:rFonts w:ascii="Amiri" w:cs="Amiri" w:eastAsia="Amiri" w:hAnsi="Amiri"/>
+                <w:position w:val="15"/>
                 <w:sz w:val="44"/>
                 <w:szCs w:val="44"/>
                 <w:rtl/>
@@ -519,18 +613,49 @@
               <w:t xml:space="preserve"> وَسَلَّـ</w:t>
             </w:r>
             <w:r>
-              <w:rPr>
-                <w:rFonts w:ascii="Amiri" w:cs="Amiri" w:eastAsia="Amiri" w:hAnsi="Amiri"/>
-                <w:color w:val="808080"/>
-                <w:sz w:val="32"/>
-                <w:szCs w:val="32"/>
-                <w:rtl/>
-              </w:rPr>
-              <w:t xml:space="preserve">................</w:t>
+              <w:drawing>
+                <wp:inline distT="0" distB="0" distL="0" distR="0">
+                  <wp:extent cx="723900" cy="400050"/>
+                  <wp:effectExtent t="0" r="0" b="0" l="0"/>
+                  <wp:docPr id="1" name="" descr="" title=""/>
+                  <wp:cNvGraphicFramePr>
+                    <a:graphicFrameLocks xmlns:a="http://schemas.openxmlformats.org/drawingml/2006/main" noChangeAspect="1"/>
+                  </wp:cNvGraphicFramePr>
+                  <a:graphic xmlns:a="http://schemas.openxmlformats.org/drawingml/2006/main">
+                    <a:graphicData uri="http://schemas.openxmlformats.org/drawingml/2006/picture">
+                      <pic:pic xmlns:pic="http://schemas.openxmlformats.org/drawingml/2006/picture">
+                        <pic:nvPicPr>
+                          <pic:cNvPr id="0" name="" descr=""/>
+                          <pic:cNvPicPr>
+                            <a:picLocks noChangeAspect="1" noChangeArrowheads="1"/>
+                          </pic:cNvPicPr>
+                        </pic:nvPicPr>
+                        <pic:blipFill>
+                          <a:blip r:embed="rId7" cstate="none"/>
+                          <a:srcRect/>
+                          <a:stretch>
+                            <a:fillRect/>
+                          </a:stretch>
+                        </pic:blipFill>
+                        <pic:spPr bwMode="auto">
+                          <a:xfrm>
+                            <a:off x="0" y="0"/>
+                            <a:ext cx="723900" cy="400050"/>
+                          </a:xfrm>
+                          <a:prstGeom prst="rect">
+                            <a:avLst/>
+                          </a:prstGeom>
+                        </pic:spPr>
+                      </pic:pic>
+                    </a:graphicData>
+                  </a:graphic>
+                </wp:inline>
+              </w:drawing>
             </w:r>
             <w:r>
               <w:rPr>
                 <w:rFonts w:ascii="Amiri" w:cs="Amiri" w:eastAsia="Amiri" w:hAnsi="Amiri"/>
+                <w:position w:val="15"/>
                 <w:sz w:val="44"/>
                 <w:szCs w:val="44"/>
                 <w:rtl/>
@@ -541,11 +666,12 @@
           <w:p>
             <w:pPr>
               <w:bidi/>
-              <w:spacing w:after="20" w:before="0" w:line="400" w:lineRule="auto"/>
+              <w:spacing w:after="20" w:before="40" w:line="300" w:lineRule="auto"/>
             </w:pPr>
             <w:r>
               <w:rPr>
                 <w:rFonts w:ascii="Amiri" w:cs="Amiri" w:eastAsia="Amiri" w:hAnsi="Amiri"/>
+                <w:position w:val="15"/>
                 <w:sz w:val="44"/>
                 <w:szCs w:val="44"/>
                 <w:rtl/>
@@ -553,18 +679,49 @@
               <w:t xml:space="preserve">عَلَى التَّلَا</w:t>
             </w:r>
             <w:r>
-              <w:rPr>
-                <w:rFonts w:ascii="Amiri" w:cs="Amiri" w:eastAsia="Amiri" w:hAnsi="Amiri"/>
-                <w:color w:val="808080"/>
-                <w:sz w:val="32"/>
-                <w:szCs w:val="32"/>
-                <w:rtl/>
-              </w:rPr>
-              <w:t xml:space="preserve">................</w:t>
+              <w:drawing>
+                <wp:inline distT="0" distB="0" distL="0" distR="0">
+                  <wp:extent cx="723900" cy="400050"/>
+                  <wp:effectExtent t="0" r="0" b="0" l="0"/>
+                  <wp:docPr id="1" name="" descr="" title=""/>
+                  <wp:cNvGraphicFramePr>
+                    <a:graphicFrameLocks xmlns:a="http://schemas.openxmlformats.org/drawingml/2006/main" noChangeAspect="1"/>
+                  </wp:cNvGraphicFramePr>
+                  <a:graphic xmlns:a="http://schemas.openxmlformats.org/drawingml/2006/main">
+                    <a:graphicData uri="http://schemas.openxmlformats.org/drawingml/2006/picture">
+                      <pic:pic xmlns:pic="http://schemas.openxmlformats.org/drawingml/2006/picture">
+                        <pic:nvPicPr>
+                          <pic:cNvPr id="0" name="" descr=""/>
+                          <pic:cNvPicPr>
+                            <a:picLocks noChangeAspect="1" noChangeArrowheads="1"/>
+                          </pic:cNvPicPr>
+                        </pic:nvPicPr>
+                        <pic:blipFill>
+                          <a:blip r:embed="rId7" cstate="none"/>
+                          <a:srcRect/>
+                          <a:stretch>
+                            <a:fillRect/>
+                          </a:stretch>
+                        </pic:blipFill>
+                        <pic:spPr bwMode="auto">
+                          <a:xfrm>
+                            <a:off x="0" y="0"/>
+                            <a:ext cx="723900" cy="400050"/>
+                          </a:xfrm>
+                          <a:prstGeom prst="rect">
+                            <a:avLst/>
+                          </a:prstGeom>
+                        </pic:spPr>
+                      </pic:pic>
+                    </a:graphicData>
+                  </a:graphic>
+                </wp:inline>
+              </w:drawing>
             </w:r>
             <w:r>
               <w:rPr>
                 <w:rFonts w:ascii="Amiri" w:cs="Amiri" w:eastAsia="Amiri" w:hAnsi="Amiri"/>
+                <w:position w:val="15"/>
                 <w:sz w:val="44"/>
                 <w:szCs w:val="44"/>
                 <w:rtl/>
@@ -985,550 +1142,6 @@
                                 </pic:cNvPicPr>
                               </pic:nvPicPr>
                               <pic:blipFill>
-                                <a:blip r:embed="rId7" cstate="none"/>
-                                <a:srcRect/>
-                                <a:stretch>
-                                  <a:fillRect/>
-                                </a:stretch>
-                              </pic:blipFill>
-                              <pic:spPr bwMode="auto">
-                                <a:xfrm>
-                                  <a:off x="0" y="0"/>
-                                  <a:ext cx="914400" cy="790575"/>
-                                </a:xfrm>
-                                <a:prstGeom prst="rect">
-                                  <a:avLst/>
-                                </a:prstGeom>
-                              </pic:spPr>
-                            </pic:pic>
-                          </a:graphicData>
-                        </a:graphic>
-                      </wp:inline>
-                    </w:drawing>
-                  </w:r>
-                </w:p>
-              </w:tc>
-            </w:tr>
-            <w:tr>
-              <w:trPr>
-                <w:trHeight w:val="160" w:hRule="exact"/>
-              </w:trPr>
-              <w:tc>
-                <w:tcPr>
-                  <w:tcW w:type="dxa" w:w="1750"/>
-                  <w:tcBorders>
-                    <w:top w:val="none" w:color="FFFFFF" w:sz="0"/>
-                    <w:left w:val="none" w:color="FFFFFF" w:sz="0"/>
-                    <w:bottom w:val="none" w:color="FFFFFF" w:sz="0"/>
-                    <w:right w:val="none" w:color="FFFFFF" w:sz="0"/>
-                  </w:tcBorders>
-                  <w:tcMar>
-                    <w:top w:type="dxa" w:w="0"/>
-                    <w:left w:type="dxa" w:w="0"/>
-                    <w:bottom w:type="dxa" w:w="0"/>
-                    <w:right w:type="dxa" w:w="0"/>
-                  </w:tcMar>
-                  <w:vAlign w:val="center"/>
-                </w:tcPr>
-                <w:p>
-                  <w:pPr>
-                    <w:spacing w:after="0" w:before="0" w:line="40" w:lineRule="exact"/>
-                  </w:pPr>
-                </w:p>
-              </w:tc>
-              <w:tc>
-                <w:tcPr>
-                  <w:tcW w:type="dxa" w:w="330"/>
-                  <w:tcBorders>
-                    <w:top w:val="none" w:color="FFFFFF" w:sz="0"/>
-                    <w:left w:val="none" w:color="FFFFFF" w:sz="0"/>
-                    <w:bottom w:val="none" w:color="FFFFFF" w:sz="0"/>
-                    <w:right w:val="none" w:color="FFFFFF" w:sz="0"/>
-                  </w:tcBorders>
-                  <w:tcMar>
-                    <w:top w:type="dxa" w:w="0"/>
-                    <w:left w:type="dxa" w:w="0"/>
-                    <w:bottom w:type="dxa" w:w="0"/>
-                    <w:right w:type="dxa" w:w="0"/>
-                  </w:tcMar>
-                  <w:vAlign w:val="center"/>
-                </w:tcPr>
-                <w:p>
-                  <w:pPr>
-                    <w:spacing w:after="0" w:before="0" w:line="40" w:lineRule="exact"/>
-                  </w:pPr>
-                </w:p>
-              </w:tc>
-              <w:tc>
-                <w:tcPr>
-                  <w:tcW w:type="dxa" w:w="750"/>
-                  <w:tcBorders>
-                    <w:top w:val="none" w:color="FFFFFF" w:sz="0"/>
-                    <w:left w:val="none" w:color="FFFFFF" w:sz="0"/>
-                    <w:bottom w:val="none" w:color="FFFFFF" w:sz="0"/>
-                    <w:right w:val="none" w:color="FFFFFF" w:sz="0"/>
-                  </w:tcBorders>
-                  <w:tcMar>
-                    <w:top w:type="dxa" w:w="0"/>
-                    <w:left w:type="dxa" w:w="0"/>
-                    <w:bottom w:type="dxa" w:w="0"/>
-                    <w:right w:type="dxa" w:w="0"/>
-                  </w:tcMar>
-                  <w:vAlign w:val="center"/>
-                </w:tcPr>
-                <w:p>
-                  <w:pPr>
-                    <w:spacing w:after="0" w:before="0" w:line="40" w:lineRule="exact"/>
-                  </w:pPr>
-                </w:p>
-              </w:tc>
-              <w:tc>
-                <w:tcPr>
-                  <w:tcW w:type="dxa" w:w="330"/>
-                  <w:tcBorders>
-                    <w:top w:val="none" w:color="FFFFFF" w:sz="0"/>
-                    <w:left w:val="none" w:color="FFFFFF" w:sz="0"/>
-                    <w:bottom w:val="none" w:color="FFFFFF" w:sz="0"/>
-                    <w:right w:val="none" w:color="FFFFFF" w:sz="0"/>
-                  </w:tcBorders>
-                  <w:tcMar>
-                    <w:top w:type="dxa" w:w="0"/>
-                    <w:left w:type="dxa" w:w="0"/>
-                    <w:bottom w:type="dxa" w:w="0"/>
-                    <w:right w:type="dxa" w:w="0"/>
-                  </w:tcMar>
-                  <w:vAlign w:val="center"/>
-                </w:tcPr>
-                <w:p>
-                  <w:pPr>
-                    <w:spacing w:after="0" w:before="0" w:line="40" w:lineRule="exact"/>
-                  </w:pPr>
-                </w:p>
-              </w:tc>
-              <w:tc>
-                <w:tcPr>
-                  <w:tcW w:type="dxa" w:w="3300"/>
-                  <w:tcBorders>
-                    <w:top w:val="none" w:color="FFFFFF" w:sz="0"/>
-                    <w:left w:val="none" w:color="FFFFFF" w:sz="0"/>
-                    <w:bottom w:val="none" w:color="FFFFFF" w:sz="0"/>
-                    <w:right w:val="none" w:color="FFFFFF" w:sz="0"/>
-                  </w:tcBorders>
-                  <w:tcMar>
-                    <w:top w:type="dxa" w:w="0"/>
-                    <w:left w:type="dxa" w:w="0"/>
-                    <w:bottom w:type="dxa" w:w="0"/>
-                    <w:right w:type="dxa" w:w="0"/>
-                  </w:tcMar>
-                  <w:vAlign w:val="center"/>
-                </w:tcPr>
-                <w:p>
-                  <w:pPr>
-                    <w:spacing w:after="0" w:before="0" w:line="40" w:lineRule="exact"/>
-                  </w:pPr>
-                </w:p>
-              </w:tc>
-              <w:tc>
-                <w:tcPr>
-                  <w:tcW w:type="dxa" w:w="330"/>
-                  <w:tcBorders>
-                    <w:top w:val="none" w:color="FFFFFF" w:sz="0"/>
-                    <w:left w:val="none" w:color="FFFFFF" w:sz="0"/>
-                    <w:bottom w:val="none" w:color="FFFFFF" w:sz="0"/>
-                    <w:right w:val="none" w:color="FFFFFF" w:sz="0"/>
-                  </w:tcBorders>
-                  <w:tcMar>
-                    <w:top w:type="dxa" w:w="0"/>
-                    <w:left w:type="dxa" w:w="0"/>
-                    <w:bottom w:type="dxa" w:w="0"/>
-                    <w:right w:type="dxa" w:w="0"/>
-                  </w:tcMar>
-                  <w:vAlign w:val="center"/>
-                </w:tcPr>
-                <w:p>
-                  <w:pPr>
-                    <w:spacing w:after="0" w:before="0" w:line="40" w:lineRule="exact"/>
-                  </w:pPr>
-                </w:p>
-              </w:tc>
-              <w:tc>
-                <w:tcPr>
-                  <w:tcW w:type="dxa" w:w="750"/>
-                  <w:tcBorders>
-                    <w:top w:val="none" w:color="FFFFFF" w:sz="0"/>
-                    <w:left w:val="none" w:color="FFFFFF" w:sz="0"/>
-                    <w:bottom w:val="none" w:color="FFFFFF" w:sz="0"/>
-                    <w:right w:val="none" w:color="FFFFFF" w:sz="0"/>
-                  </w:tcBorders>
-                  <w:tcMar>
-                    <w:top w:type="dxa" w:w="0"/>
-                    <w:left w:type="dxa" w:w="0"/>
-                    <w:bottom w:type="dxa" w:w="0"/>
-                    <w:right w:type="dxa" w:w="0"/>
-                  </w:tcMar>
-                  <w:vAlign w:val="center"/>
-                </w:tcPr>
-                <w:p>
-                  <w:pPr>
-                    <w:spacing w:after="0" w:before="0" w:line="40" w:lineRule="exact"/>
-                  </w:pPr>
-                </w:p>
-              </w:tc>
-              <w:tc>
-                <w:tcPr>
-                  <w:tcW w:type="dxa" w:w="330"/>
-                  <w:tcBorders>
-                    <w:top w:val="none" w:color="FFFFFF" w:sz="0"/>
-                    <w:left w:val="none" w:color="FFFFFF" w:sz="0"/>
-                    <w:bottom w:val="none" w:color="FFFFFF" w:sz="0"/>
-                    <w:right w:val="none" w:color="FFFFFF" w:sz="0"/>
-                  </w:tcBorders>
-                  <w:tcMar>
-                    <w:top w:type="dxa" w:w="0"/>
-                    <w:left w:type="dxa" w:w="0"/>
-                    <w:bottom w:type="dxa" w:w="0"/>
-                    <w:right w:type="dxa" w:w="0"/>
-                  </w:tcMar>
-                  <w:vAlign w:val="center"/>
-                </w:tcPr>
-                <w:p>
-                  <w:pPr>
-                    <w:spacing w:after="0" w:before="0" w:line="40" w:lineRule="exact"/>
-                  </w:pPr>
-                </w:p>
-              </w:tc>
-              <w:tc>
-                <w:tcPr>
-                  <w:tcW w:type="dxa" w:w="1900"/>
-                  <w:tcBorders>
-                    <w:top w:val="none" w:color="FFFFFF" w:sz="0"/>
-                    <w:left w:val="none" w:color="FFFFFF" w:sz="0"/>
-                    <w:bottom w:val="none" w:color="FFFFFF" w:sz="0"/>
-                    <w:right w:val="none" w:color="FFFFFF" w:sz="0"/>
-                  </w:tcBorders>
-                  <w:tcMar>
-                    <w:top w:type="dxa" w:w="0"/>
-                    <w:left w:type="dxa" w:w="0"/>
-                    <w:bottom w:type="dxa" w:w="0"/>
-                    <w:right w:type="dxa" w:w="0"/>
-                  </w:tcMar>
-                  <w:vAlign w:val="center"/>
-                </w:tcPr>
-                <w:p>
-                  <w:pPr>
-                    <w:spacing w:after="0" w:before="0" w:line="40" w:lineRule="exact"/>
-                  </w:pPr>
-                </w:p>
-              </w:tc>
-            </w:tr>
-            <w:tr>
-              <w:trPr>
-                <w:cantSplit/>
-              </w:trPr>
-              <w:tc>
-                <w:tcPr>
-                  <w:tcW w:type="dxa" w:w="1750"/>
-                  <w:tcBorders>
-                    <w:top w:val="single" w:color="595959" w:sz="12"/>
-                    <w:left w:val="single" w:color="595959" w:sz="12"/>
-                    <w:bottom w:val="single" w:color="595959" w:sz="12"/>
-                    <w:right w:val="single" w:color="595959" w:sz="12"/>
-                  </w:tcBorders>
-                  <w:shd w:fill="E2EFDA" w:color="auto" w:val="clear"/>
-                  <w:tcMar>
-                    <w:top w:type="dxa" w:w="60"/>
-                    <w:left w:type="dxa" w:w="80"/>
-                    <w:bottom w:type="dxa" w:w="60"/>
-                    <w:right w:type="dxa" w:w="80"/>
-                  </w:tcMar>
-                  <w:vAlign w:val="center"/>
-                </w:tcPr>
-                <w:p>
-                  <w:pPr>
-                    <w:bidi/>
-                    <w:spacing w:after="20" w:before="20" w:line="320" w:lineRule="auto"/>
-                    <w:jc w:val="center"/>
-                  </w:pPr>
-                  <w:r>
-                    <w:rPr>
-                      <w:rFonts w:ascii="Amiri" w:cs="Amiri" w:eastAsia="Amiri" w:hAnsi="Amiri"/>
-                      <w:b/>
-                      <w:bCs/>
-                      <w:sz w:val="40"/>
-                      <w:szCs w:val="40"/>
-                      <w:rtl/>
-                    </w:rPr>
-                    <w:t xml:space="preserve">عَلَمُ</w:t>
-                  </w:r>
-                </w:p>
-              </w:tc>
-              <w:tc>
-                <w:tcPr>
-                  <w:tcW w:type="dxa" w:w="330"/>
-                  <w:tcBorders>
-                    <w:top w:val="none" w:color="FFFFFF" w:sz="0"/>
-                    <w:left w:val="none" w:color="FFFFFF" w:sz="0"/>
-                    <w:bottom w:val="none" w:color="FFFFFF" w:sz="0"/>
-                    <w:right w:val="none" w:color="FFFFFF" w:sz="0"/>
-                  </w:tcBorders>
-                  <w:tcMar>
-                    <w:top w:type="dxa" w:w="60"/>
-                    <w:left w:type="dxa" w:w="80"/>
-                    <w:bottom w:type="dxa" w:w="60"/>
-                    <w:right w:type="dxa" w:w="80"/>
-                  </w:tcMar>
-                  <w:vAlign w:val="center"/>
-                </w:tcPr>
-                <w:p>
-                  <w:pPr>
-                    <w:bidi/>
-                    <w:spacing w:after="0" w:before="0" w:line="360" w:lineRule="auto"/>
-                    <w:jc w:val="center"/>
-                  </w:pPr>
-                  <w:r>
-                    <w:rPr>
-                      <w:rFonts w:ascii="Amiri" w:cs="Amiri" w:eastAsia="Amiri" w:hAnsi="Amiri"/>
-                      <w:color w:val="1F3864"/>
-                      <w:sz w:val="24"/>
-                      <w:szCs w:val="24"/>
-                      <w:rtl/>
-                    </w:rPr>
-                    <w:t xml:space="preserve">●</w:t>
-                  </w:r>
-                </w:p>
-              </w:tc>
-              <w:tc>
-                <w:tcPr>
-                  <w:tcW w:type="dxa" w:w="750"/>
-                  <w:tcBorders>
-                    <w:top w:val="none" w:color="FFFFFF" w:sz="0"/>
-                    <w:left w:val="none" w:color="FFFFFF" w:sz="0"/>
-                    <w:bottom w:val="none" w:color="FFFFFF" w:sz="0"/>
-                    <w:right w:val="none" w:color="FFFFFF" w:sz="0"/>
-                  </w:tcBorders>
-                  <w:tcMar>
-                    <w:top w:type="dxa" w:w="60"/>
-                    <w:left w:type="dxa" w:w="80"/>
-                    <w:bottom w:type="dxa" w:w="60"/>
-                    <w:right w:type="dxa" w:w="80"/>
-                  </w:tcMar>
-                  <w:vAlign w:val="center"/>
-                </w:tcPr>
-                <w:p>
-                  <w:pPr>
-                    <w:bidi/>
-                    <w:spacing w:after="60" w:before="60" w:line="360" w:lineRule="auto"/>
-                  </w:pPr>
-                </w:p>
-              </w:tc>
-              <w:tc>
-                <w:tcPr>
-                  <w:tcW w:type="dxa" w:w="330"/>
-                  <w:tcBorders>
-                    <w:top w:val="none" w:color="FFFFFF" w:sz="0"/>
-                    <w:left w:val="none" w:color="FFFFFF" w:sz="0"/>
-                    <w:bottom w:val="none" w:color="FFFFFF" w:sz="0"/>
-                    <w:right w:val="none" w:color="FFFFFF" w:sz="0"/>
-                  </w:tcBorders>
-                  <w:tcMar>
-                    <w:top w:type="dxa" w:w="60"/>
-                    <w:left w:type="dxa" w:w="80"/>
-                    <w:bottom w:type="dxa" w:w="60"/>
-                    <w:right w:type="dxa" w:w="80"/>
-                  </w:tcMar>
-                  <w:vAlign w:val="center"/>
-                </w:tcPr>
-                <w:p>
-                  <w:pPr>
-                    <w:bidi/>
-                    <w:spacing w:after="0" w:before="0" w:line="360" w:lineRule="auto"/>
-                    <w:jc w:val="center"/>
-                  </w:pPr>
-                  <w:r>
-                    <w:rPr>
-                      <w:rFonts w:ascii="Amiri" w:cs="Amiri" w:eastAsia="Amiri" w:hAnsi="Amiri"/>
-                      <w:color w:val="1F3864"/>
-                      <w:sz w:val="24"/>
-                      <w:szCs w:val="24"/>
-                      <w:rtl/>
-                    </w:rPr>
-                    <w:t xml:space="preserve">●</w:t>
-                  </w:r>
-                </w:p>
-              </w:tc>
-              <w:tc>
-                <w:tcPr>
-                  <w:tcW w:type="dxa" w:w="3300"/>
-                  <w:tcBorders>
-                    <w:top w:val="single" w:color="595959" w:sz="12"/>
-                    <w:left w:val="single" w:color="595959" w:sz="12"/>
-                    <w:bottom w:val="single" w:color="595959" w:sz="12"/>
-                    <w:right w:val="single" w:color="595959" w:sz="12"/>
-                  </w:tcBorders>
-                  <w:shd w:fill="FBE4D5" w:color="auto" w:val="clear"/>
-                  <w:tcMar>
-                    <w:top w:type="dxa" w:w="60"/>
-                    <w:left w:type="dxa" w:w="80"/>
-                    <w:bottom w:type="dxa" w:w="60"/>
-                    <w:right w:type="dxa" w:w="80"/>
-                  </w:tcMar>
-                  <w:vAlign w:val="center"/>
-                </w:tcPr>
-                <w:p>
-                  <w:pPr>
-                    <w:bidi/>
-                    <w:spacing w:after="20" w:before="20" w:line="320" w:lineRule="auto"/>
-                    <w:jc w:val="center"/>
-                  </w:pPr>
-                  <w:r>
-                    <w:rPr>
-                      <w:rFonts w:ascii="Amiri" w:cs="Amiri" w:eastAsia="Amiri" w:hAnsi="Amiri"/>
-                      <w:b/>
-                      <w:bCs/>
-                      <w:sz w:val="40"/>
-                      <w:szCs w:val="40"/>
-                      <w:rtl/>
-                    </w:rPr>
-                    <w:t xml:space="preserve">قُرْبَ مَمَرِّ الْمُتَرَجِّلِينَ</w:t>
-                  </w:r>
-                </w:p>
-              </w:tc>
-              <w:tc>
-                <w:tcPr>
-                  <w:tcW w:type="dxa" w:w="330"/>
-                  <w:tcBorders>
-                    <w:top w:val="none" w:color="FFFFFF" w:sz="0"/>
-                    <w:left w:val="none" w:color="FFFFFF" w:sz="0"/>
-                    <w:bottom w:val="none" w:color="FFFFFF" w:sz="0"/>
-                    <w:right w:val="none" w:color="FFFFFF" w:sz="0"/>
-                  </w:tcBorders>
-                  <w:tcMar>
-                    <w:top w:type="dxa" w:w="60"/>
-                    <w:left w:type="dxa" w:w="80"/>
-                    <w:bottom w:type="dxa" w:w="60"/>
-                    <w:right w:type="dxa" w:w="80"/>
-                  </w:tcMar>
-                  <w:vAlign w:val="center"/>
-                </w:tcPr>
-                <w:p>
-                  <w:pPr>
-                    <w:bidi/>
-                    <w:spacing w:after="0" w:before="0" w:line="360" w:lineRule="auto"/>
-                    <w:jc w:val="center"/>
-                  </w:pPr>
-                  <w:r>
-                    <w:rPr>
-                      <w:rFonts w:ascii="Amiri" w:cs="Amiri" w:eastAsia="Amiri" w:hAnsi="Amiri"/>
-                      <w:color w:val="1F3864"/>
-                      <w:sz w:val="24"/>
-                      <w:szCs w:val="24"/>
-                      <w:rtl/>
-                    </w:rPr>
-                    <w:t xml:space="preserve">●</w:t>
-                  </w:r>
-                </w:p>
-              </w:tc>
-              <w:tc>
-                <w:tcPr>
-                  <w:tcW w:type="dxa" w:w="750"/>
-                  <w:tcBorders>
-                    <w:top w:val="none" w:color="FFFFFF" w:sz="0"/>
-                    <w:left w:val="none" w:color="FFFFFF" w:sz="0"/>
-                    <w:bottom w:val="none" w:color="FFFFFF" w:sz="0"/>
-                    <w:right w:val="none" w:color="FFFFFF" w:sz="0"/>
-                  </w:tcBorders>
-                  <w:tcMar>
-                    <w:top w:type="dxa" w:w="60"/>
-                    <w:left w:type="dxa" w:w="80"/>
-                    <w:bottom w:type="dxa" w:w="60"/>
-                    <w:right w:type="dxa" w:w="80"/>
-                  </w:tcMar>
-                  <w:vAlign w:val="center"/>
-                </w:tcPr>
-                <w:p>
-                  <w:pPr>
-                    <w:bidi/>
-                    <w:spacing w:after="60" w:before="60" w:line="360" w:lineRule="auto"/>
-                  </w:pPr>
-                </w:p>
-              </w:tc>
-              <w:tc>
-                <w:tcPr>
-                  <w:tcW w:type="dxa" w:w="330"/>
-                  <w:tcBorders>
-                    <w:top w:val="none" w:color="FFFFFF" w:sz="0"/>
-                    <w:left w:val="none" w:color="FFFFFF" w:sz="0"/>
-                    <w:bottom w:val="none" w:color="FFFFFF" w:sz="0"/>
-                    <w:right w:val="none" w:color="FFFFFF" w:sz="0"/>
-                  </w:tcBorders>
-                  <w:tcMar>
-                    <w:top w:type="dxa" w:w="60"/>
-                    <w:left w:type="dxa" w:w="80"/>
-                    <w:bottom w:type="dxa" w:w="60"/>
-                    <w:right w:type="dxa" w:w="80"/>
-                  </w:tcMar>
-                  <w:vAlign w:val="center"/>
-                </w:tcPr>
-                <w:p>
-                  <w:pPr>
-                    <w:bidi/>
-                    <w:spacing w:after="0" w:before="0" w:line="360" w:lineRule="auto"/>
-                    <w:jc w:val="center"/>
-                  </w:pPr>
-                  <w:r>
-                    <w:rPr>
-                      <w:rFonts w:ascii="Amiri" w:cs="Amiri" w:eastAsia="Amiri" w:hAnsi="Amiri"/>
-                      <w:color w:val="1F3864"/>
-                      <w:sz w:val="24"/>
-                      <w:szCs w:val="24"/>
-                      <w:rtl/>
-                    </w:rPr>
-                    <w:t xml:space="preserve">●</w:t>
-                  </w:r>
-                </w:p>
-              </w:tc>
-              <w:tc>
-                <w:tcPr>
-                  <w:tcW w:type="dxa" w:w="1900"/>
-                  <w:tcBorders>
-                    <w:top w:val="none" w:color="FFFFFF" w:sz="0"/>
-                    <w:left w:val="none" w:color="FFFFFF" w:sz="0"/>
-                    <w:bottom w:val="none" w:color="FFFFFF" w:sz="0"/>
-                    <w:right w:val="none" w:color="FFFFFF" w:sz="0"/>
-                  </w:tcBorders>
-                  <w:tcMar>
-                    <w:top w:type="dxa" w:w="45"/>
-                    <w:left w:type="dxa" w:w="40"/>
-                    <w:bottom w:type="dxa" w:w="45"/>
-                    <w:right w:type="dxa" w:w="40"/>
-                  </w:tcMar>
-                  <w:vAlign w:val="center"/>
-                </w:tcPr>
-                <w:p>
-                  <w:pPr>
-                    <w:bidi/>
-                    <w:spacing w:after="0" w:before="0" w:line="240" w:lineRule="auto"/>
-                    <w:jc w:val="center"/>
-                  </w:pPr>
-                  <w:r>
-                    <w:drawing>
-                      <wp:inline distT="0" distB="0" distL="0" distR="0">
-                        <wp:extent cx="914400" cy="790575"/>
-                        <wp:effectExtent t="0" r="0" b="0" l="0"/>
-                        <wp:docPr id="1" name="" descr="" title=""/>
-                        <wp:cNvGraphicFramePr>
-                          <a:graphicFrameLocks xmlns:a="http://schemas.openxmlformats.org/drawingml/2006/main" noChangeAspect="1"/>
-                        </wp:cNvGraphicFramePr>
-                        <a:graphic xmlns:a="http://schemas.openxmlformats.org/drawingml/2006/main">
-                          <a:graphicData uri="http://schemas.openxmlformats.org/drawingml/2006/picture">
-                            <pic:pic xmlns:pic="http://schemas.openxmlformats.org/drawingml/2006/picture">
-                              <pic:nvPicPr>
-                                <pic:cNvPr id="0" name="" descr=""/>
-                                <pic:cNvPicPr>
-                                  <a:picLocks noChangeAspect="1" noChangeArrowheads="1"/>
-                                </pic:cNvPicPr>
-                              </pic:nvPicPr>
-                              <pic:blipFill>
                                 <a:blip r:embed="rId8" cstate="none"/>
                                 <a:srcRect/>
                                 <a:stretch>
@@ -1802,7 +1415,7 @@
                       <w:szCs w:val="40"/>
                       <w:rtl/>
                     </w:rPr>
-                    <w:t xml:space="preserve">مَعْرِضُ</w:t>
+                    <w:t xml:space="preserve">عَلَمُ</w:t>
                   </w:r>
                 </w:p>
               </w:tc>
@@ -1933,7 +1546,7 @@
                       <w:szCs w:val="40"/>
                       <w:rtl/>
                     </w:rPr>
-                    <w:t xml:space="preserve">بِلَادِي يُرَفْرِفُ</w:t>
+                    <w:t xml:space="preserve">قُرْبَ مَمَرِّ الْمُتَرَجِّلِينَ</w:t>
                   </w:r>
                 </w:p>
               </w:tc>
@@ -2346,7 +1959,7 @@
                       <w:szCs w:val="40"/>
                       <w:rtl/>
                     </w:rPr>
-                    <w:t xml:space="preserve">سَامِي</w:t>
+                    <w:t xml:space="preserve">مَعْرِضُ</w:t>
                   </w:r>
                 </w:p>
               </w:tc>
@@ -2477,7 +2090,7 @@
                       <w:szCs w:val="40"/>
                       <w:rtl/>
                     </w:rPr>
-                    <w:t xml:space="preserve">جَمِيلَةٌ وَحَمْرَاءُ</w:t>
+                    <w:t xml:space="preserve">بِلَادِي يُرَفْرِفُ</w:t>
                   </w:r>
                 </w:p>
               </w:tc>
@@ -2618,6 +2231,550 @@
                               </pic:nvPicPr>
                               <pic:blipFill>
                                 <a:blip r:embed="rId10" cstate="none"/>
+                                <a:srcRect/>
+                                <a:stretch>
+                                  <a:fillRect/>
+                                </a:stretch>
+                              </pic:blipFill>
+                              <pic:spPr bwMode="auto">
+                                <a:xfrm>
+                                  <a:off x="0" y="0"/>
+                                  <a:ext cx="914400" cy="790575"/>
+                                </a:xfrm>
+                                <a:prstGeom prst="rect">
+                                  <a:avLst/>
+                                </a:prstGeom>
+                              </pic:spPr>
+                            </pic:pic>
+                          </a:graphicData>
+                        </a:graphic>
+                      </wp:inline>
+                    </w:drawing>
+                  </w:r>
+                </w:p>
+              </w:tc>
+            </w:tr>
+            <w:tr>
+              <w:trPr>
+                <w:trHeight w:val="160" w:hRule="exact"/>
+              </w:trPr>
+              <w:tc>
+                <w:tcPr>
+                  <w:tcW w:type="dxa" w:w="1750"/>
+                  <w:tcBorders>
+                    <w:top w:val="none" w:color="FFFFFF" w:sz="0"/>
+                    <w:left w:val="none" w:color="FFFFFF" w:sz="0"/>
+                    <w:bottom w:val="none" w:color="FFFFFF" w:sz="0"/>
+                    <w:right w:val="none" w:color="FFFFFF" w:sz="0"/>
+                  </w:tcBorders>
+                  <w:tcMar>
+                    <w:top w:type="dxa" w:w="0"/>
+                    <w:left w:type="dxa" w:w="0"/>
+                    <w:bottom w:type="dxa" w:w="0"/>
+                    <w:right w:type="dxa" w:w="0"/>
+                  </w:tcMar>
+                  <w:vAlign w:val="center"/>
+                </w:tcPr>
+                <w:p>
+                  <w:pPr>
+                    <w:spacing w:after="0" w:before="0" w:line="40" w:lineRule="exact"/>
+                  </w:pPr>
+                </w:p>
+              </w:tc>
+              <w:tc>
+                <w:tcPr>
+                  <w:tcW w:type="dxa" w:w="330"/>
+                  <w:tcBorders>
+                    <w:top w:val="none" w:color="FFFFFF" w:sz="0"/>
+                    <w:left w:val="none" w:color="FFFFFF" w:sz="0"/>
+                    <w:bottom w:val="none" w:color="FFFFFF" w:sz="0"/>
+                    <w:right w:val="none" w:color="FFFFFF" w:sz="0"/>
+                  </w:tcBorders>
+                  <w:tcMar>
+                    <w:top w:type="dxa" w:w="0"/>
+                    <w:left w:type="dxa" w:w="0"/>
+                    <w:bottom w:type="dxa" w:w="0"/>
+                    <w:right w:type="dxa" w:w="0"/>
+                  </w:tcMar>
+                  <w:vAlign w:val="center"/>
+                </w:tcPr>
+                <w:p>
+                  <w:pPr>
+                    <w:spacing w:after="0" w:before="0" w:line="40" w:lineRule="exact"/>
+                  </w:pPr>
+                </w:p>
+              </w:tc>
+              <w:tc>
+                <w:tcPr>
+                  <w:tcW w:type="dxa" w:w="750"/>
+                  <w:tcBorders>
+                    <w:top w:val="none" w:color="FFFFFF" w:sz="0"/>
+                    <w:left w:val="none" w:color="FFFFFF" w:sz="0"/>
+                    <w:bottom w:val="none" w:color="FFFFFF" w:sz="0"/>
+                    <w:right w:val="none" w:color="FFFFFF" w:sz="0"/>
+                  </w:tcBorders>
+                  <w:tcMar>
+                    <w:top w:type="dxa" w:w="0"/>
+                    <w:left w:type="dxa" w:w="0"/>
+                    <w:bottom w:type="dxa" w:w="0"/>
+                    <w:right w:type="dxa" w:w="0"/>
+                  </w:tcMar>
+                  <w:vAlign w:val="center"/>
+                </w:tcPr>
+                <w:p>
+                  <w:pPr>
+                    <w:spacing w:after="0" w:before="0" w:line="40" w:lineRule="exact"/>
+                  </w:pPr>
+                </w:p>
+              </w:tc>
+              <w:tc>
+                <w:tcPr>
+                  <w:tcW w:type="dxa" w:w="330"/>
+                  <w:tcBorders>
+                    <w:top w:val="none" w:color="FFFFFF" w:sz="0"/>
+                    <w:left w:val="none" w:color="FFFFFF" w:sz="0"/>
+                    <w:bottom w:val="none" w:color="FFFFFF" w:sz="0"/>
+                    <w:right w:val="none" w:color="FFFFFF" w:sz="0"/>
+                  </w:tcBorders>
+                  <w:tcMar>
+                    <w:top w:type="dxa" w:w="0"/>
+                    <w:left w:type="dxa" w:w="0"/>
+                    <w:bottom w:type="dxa" w:w="0"/>
+                    <w:right w:type="dxa" w:w="0"/>
+                  </w:tcMar>
+                  <w:vAlign w:val="center"/>
+                </w:tcPr>
+                <w:p>
+                  <w:pPr>
+                    <w:spacing w:after="0" w:before="0" w:line="40" w:lineRule="exact"/>
+                  </w:pPr>
+                </w:p>
+              </w:tc>
+              <w:tc>
+                <w:tcPr>
+                  <w:tcW w:type="dxa" w:w="3300"/>
+                  <w:tcBorders>
+                    <w:top w:val="none" w:color="FFFFFF" w:sz="0"/>
+                    <w:left w:val="none" w:color="FFFFFF" w:sz="0"/>
+                    <w:bottom w:val="none" w:color="FFFFFF" w:sz="0"/>
+                    <w:right w:val="none" w:color="FFFFFF" w:sz="0"/>
+                  </w:tcBorders>
+                  <w:tcMar>
+                    <w:top w:type="dxa" w:w="0"/>
+                    <w:left w:type="dxa" w:w="0"/>
+                    <w:bottom w:type="dxa" w:w="0"/>
+                    <w:right w:type="dxa" w:w="0"/>
+                  </w:tcMar>
+                  <w:vAlign w:val="center"/>
+                </w:tcPr>
+                <w:p>
+                  <w:pPr>
+                    <w:spacing w:after="0" w:before="0" w:line="40" w:lineRule="exact"/>
+                  </w:pPr>
+                </w:p>
+              </w:tc>
+              <w:tc>
+                <w:tcPr>
+                  <w:tcW w:type="dxa" w:w="330"/>
+                  <w:tcBorders>
+                    <w:top w:val="none" w:color="FFFFFF" w:sz="0"/>
+                    <w:left w:val="none" w:color="FFFFFF" w:sz="0"/>
+                    <w:bottom w:val="none" w:color="FFFFFF" w:sz="0"/>
+                    <w:right w:val="none" w:color="FFFFFF" w:sz="0"/>
+                  </w:tcBorders>
+                  <w:tcMar>
+                    <w:top w:type="dxa" w:w="0"/>
+                    <w:left w:type="dxa" w:w="0"/>
+                    <w:bottom w:type="dxa" w:w="0"/>
+                    <w:right w:type="dxa" w:w="0"/>
+                  </w:tcMar>
+                  <w:vAlign w:val="center"/>
+                </w:tcPr>
+                <w:p>
+                  <w:pPr>
+                    <w:spacing w:after="0" w:before="0" w:line="40" w:lineRule="exact"/>
+                  </w:pPr>
+                </w:p>
+              </w:tc>
+              <w:tc>
+                <w:tcPr>
+                  <w:tcW w:type="dxa" w:w="750"/>
+                  <w:tcBorders>
+                    <w:top w:val="none" w:color="FFFFFF" w:sz="0"/>
+                    <w:left w:val="none" w:color="FFFFFF" w:sz="0"/>
+                    <w:bottom w:val="none" w:color="FFFFFF" w:sz="0"/>
+                    <w:right w:val="none" w:color="FFFFFF" w:sz="0"/>
+                  </w:tcBorders>
+                  <w:tcMar>
+                    <w:top w:type="dxa" w:w="0"/>
+                    <w:left w:type="dxa" w:w="0"/>
+                    <w:bottom w:type="dxa" w:w="0"/>
+                    <w:right w:type="dxa" w:w="0"/>
+                  </w:tcMar>
+                  <w:vAlign w:val="center"/>
+                </w:tcPr>
+                <w:p>
+                  <w:pPr>
+                    <w:spacing w:after="0" w:before="0" w:line="40" w:lineRule="exact"/>
+                  </w:pPr>
+                </w:p>
+              </w:tc>
+              <w:tc>
+                <w:tcPr>
+                  <w:tcW w:type="dxa" w:w="330"/>
+                  <w:tcBorders>
+                    <w:top w:val="none" w:color="FFFFFF" w:sz="0"/>
+                    <w:left w:val="none" w:color="FFFFFF" w:sz="0"/>
+                    <w:bottom w:val="none" w:color="FFFFFF" w:sz="0"/>
+                    <w:right w:val="none" w:color="FFFFFF" w:sz="0"/>
+                  </w:tcBorders>
+                  <w:tcMar>
+                    <w:top w:type="dxa" w:w="0"/>
+                    <w:left w:type="dxa" w:w="0"/>
+                    <w:bottom w:type="dxa" w:w="0"/>
+                    <w:right w:type="dxa" w:w="0"/>
+                  </w:tcMar>
+                  <w:vAlign w:val="center"/>
+                </w:tcPr>
+                <w:p>
+                  <w:pPr>
+                    <w:spacing w:after="0" w:before="0" w:line="40" w:lineRule="exact"/>
+                  </w:pPr>
+                </w:p>
+              </w:tc>
+              <w:tc>
+                <w:tcPr>
+                  <w:tcW w:type="dxa" w:w="1900"/>
+                  <w:tcBorders>
+                    <w:top w:val="none" w:color="FFFFFF" w:sz="0"/>
+                    <w:left w:val="none" w:color="FFFFFF" w:sz="0"/>
+                    <w:bottom w:val="none" w:color="FFFFFF" w:sz="0"/>
+                    <w:right w:val="none" w:color="FFFFFF" w:sz="0"/>
+                  </w:tcBorders>
+                  <w:tcMar>
+                    <w:top w:type="dxa" w:w="0"/>
+                    <w:left w:type="dxa" w:w="0"/>
+                    <w:bottom w:type="dxa" w:w="0"/>
+                    <w:right w:type="dxa" w:w="0"/>
+                  </w:tcMar>
+                  <w:vAlign w:val="center"/>
+                </w:tcPr>
+                <w:p>
+                  <w:pPr>
+                    <w:spacing w:after="0" w:before="0" w:line="40" w:lineRule="exact"/>
+                  </w:pPr>
+                </w:p>
+              </w:tc>
+            </w:tr>
+            <w:tr>
+              <w:trPr>
+                <w:cantSplit/>
+              </w:trPr>
+              <w:tc>
+                <w:tcPr>
+                  <w:tcW w:type="dxa" w:w="1750"/>
+                  <w:tcBorders>
+                    <w:top w:val="single" w:color="595959" w:sz="12"/>
+                    <w:left w:val="single" w:color="595959" w:sz="12"/>
+                    <w:bottom w:val="single" w:color="595959" w:sz="12"/>
+                    <w:right w:val="single" w:color="595959" w:sz="12"/>
+                  </w:tcBorders>
+                  <w:shd w:fill="E2EFDA" w:color="auto" w:val="clear"/>
+                  <w:tcMar>
+                    <w:top w:type="dxa" w:w="60"/>
+                    <w:left w:type="dxa" w:w="80"/>
+                    <w:bottom w:type="dxa" w:w="60"/>
+                    <w:right w:type="dxa" w:w="80"/>
+                  </w:tcMar>
+                  <w:vAlign w:val="center"/>
+                </w:tcPr>
+                <w:p>
+                  <w:pPr>
+                    <w:bidi/>
+                    <w:spacing w:after="20" w:before="20" w:line="320" w:lineRule="auto"/>
+                    <w:jc w:val="center"/>
+                  </w:pPr>
+                  <w:r>
+                    <w:rPr>
+                      <w:rFonts w:ascii="Amiri" w:cs="Amiri" w:eastAsia="Amiri" w:hAnsi="Amiri"/>
+                      <w:b/>
+                      <w:bCs/>
+                      <w:sz w:val="40"/>
+                      <w:szCs w:val="40"/>
+                      <w:rtl/>
+                    </w:rPr>
+                    <w:t xml:space="preserve">سَامِي</w:t>
+                  </w:r>
+                </w:p>
+              </w:tc>
+              <w:tc>
+                <w:tcPr>
+                  <w:tcW w:type="dxa" w:w="330"/>
+                  <w:tcBorders>
+                    <w:top w:val="none" w:color="FFFFFF" w:sz="0"/>
+                    <w:left w:val="none" w:color="FFFFFF" w:sz="0"/>
+                    <w:bottom w:val="none" w:color="FFFFFF" w:sz="0"/>
+                    <w:right w:val="none" w:color="FFFFFF" w:sz="0"/>
+                  </w:tcBorders>
+                  <w:tcMar>
+                    <w:top w:type="dxa" w:w="60"/>
+                    <w:left w:type="dxa" w:w="80"/>
+                    <w:bottom w:type="dxa" w:w="60"/>
+                    <w:right w:type="dxa" w:w="80"/>
+                  </w:tcMar>
+                  <w:vAlign w:val="center"/>
+                </w:tcPr>
+                <w:p>
+                  <w:pPr>
+                    <w:bidi/>
+                    <w:spacing w:after="0" w:before="0" w:line="360" w:lineRule="auto"/>
+                    <w:jc w:val="center"/>
+                  </w:pPr>
+                  <w:r>
+                    <w:rPr>
+                      <w:rFonts w:ascii="Amiri" w:cs="Amiri" w:eastAsia="Amiri" w:hAnsi="Amiri"/>
+                      <w:color w:val="1F3864"/>
+                      <w:sz w:val="24"/>
+                      <w:szCs w:val="24"/>
+                      <w:rtl/>
+                    </w:rPr>
+                    <w:t xml:space="preserve">●</w:t>
+                  </w:r>
+                </w:p>
+              </w:tc>
+              <w:tc>
+                <w:tcPr>
+                  <w:tcW w:type="dxa" w:w="750"/>
+                  <w:tcBorders>
+                    <w:top w:val="none" w:color="FFFFFF" w:sz="0"/>
+                    <w:left w:val="none" w:color="FFFFFF" w:sz="0"/>
+                    <w:bottom w:val="none" w:color="FFFFFF" w:sz="0"/>
+                    <w:right w:val="none" w:color="FFFFFF" w:sz="0"/>
+                  </w:tcBorders>
+                  <w:tcMar>
+                    <w:top w:type="dxa" w:w="60"/>
+                    <w:left w:type="dxa" w:w="80"/>
+                    <w:bottom w:type="dxa" w:w="60"/>
+                    <w:right w:type="dxa" w:w="80"/>
+                  </w:tcMar>
+                  <w:vAlign w:val="center"/>
+                </w:tcPr>
+                <w:p>
+                  <w:pPr>
+                    <w:bidi/>
+                    <w:spacing w:after="60" w:before="60" w:line="360" w:lineRule="auto"/>
+                  </w:pPr>
+                </w:p>
+              </w:tc>
+              <w:tc>
+                <w:tcPr>
+                  <w:tcW w:type="dxa" w:w="330"/>
+                  <w:tcBorders>
+                    <w:top w:val="none" w:color="FFFFFF" w:sz="0"/>
+                    <w:left w:val="none" w:color="FFFFFF" w:sz="0"/>
+                    <w:bottom w:val="none" w:color="FFFFFF" w:sz="0"/>
+                    <w:right w:val="none" w:color="FFFFFF" w:sz="0"/>
+                  </w:tcBorders>
+                  <w:tcMar>
+                    <w:top w:type="dxa" w:w="60"/>
+                    <w:left w:type="dxa" w:w="80"/>
+                    <w:bottom w:type="dxa" w:w="60"/>
+                    <w:right w:type="dxa" w:w="80"/>
+                  </w:tcMar>
+                  <w:vAlign w:val="center"/>
+                </w:tcPr>
+                <w:p>
+                  <w:pPr>
+                    <w:bidi/>
+                    <w:spacing w:after="0" w:before="0" w:line="360" w:lineRule="auto"/>
+                    <w:jc w:val="center"/>
+                  </w:pPr>
+                  <w:r>
+                    <w:rPr>
+                      <w:rFonts w:ascii="Amiri" w:cs="Amiri" w:eastAsia="Amiri" w:hAnsi="Amiri"/>
+                      <w:color w:val="1F3864"/>
+                      <w:sz w:val="24"/>
+                      <w:szCs w:val="24"/>
+                      <w:rtl/>
+                    </w:rPr>
+                    <w:t xml:space="preserve">●</w:t>
+                  </w:r>
+                </w:p>
+              </w:tc>
+              <w:tc>
+                <w:tcPr>
+                  <w:tcW w:type="dxa" w:w="3300"/>
+                  <w:tcBorders>
+                    <w:top w:val="single" w:color="595959" w:sz="12"/>
+                    <w:left w:val="single" w:color="595959" w:sz="12"/>
+                    <w:bottom w:val="single" w:color="595959" w:sz="12"/>
+                    <w:right w:val="single" w:color="595959" w:sz="12"/>
+                  </w:tcBorders>
+                  <w:shd w:fill="FBE4D5" w:color="auto" w:val="clear"/>
+                  <w:tcMar>
+                    <w:top w:type="dxa" w:w="60"/>
+                    <w:left w:type="dxa" w:w="80"/>
+                    <w:bottom w:type="dxa" w:w="60"/>
+                    <w:right w:type="dxa" w:w="80"/>
+                  </w:tcMar>
+                  <w:vAlign w:val="center"/>
+                </w:tcPr>
+                <w:p>
+                  <w:pPr>
+                    <w:bidi/>
+                    <w:spacing w:after="20" w:before="20" w:line="320" w:lineRule="auto"/>
+                    <w:jc w:val="center"/>
+                  </w:pPr>
+                  <w:r>
+                    <w:rPr>
+                      <w:rFonts w:ascii="Amiri" w:cs="Amiri" w:eastAsia="Amiri" w:hAnsi="Amiri"/>
+                      <w:b/>
+                      <w:bCs/>
+                      <w:sz w:val="40"/>
+                      <w:szCs w:val="40"/>
+                      <w:rtl/>
+                    </w:rPr>
+                    <w:t xml:space="preserve">جَمِيلَةٌ وَحَمْرَاءُ</w:t>
+                  </w:r>
+                </w:p>
+              </w:tc>
+              <w:tc>
+                <w:tcPr>
+                  <w:tcW w:type="dxa" w:w="330"/>
+                  <w:tcBorders>
+                    <w:top w:val="none" w:color="FFFFFF" w:sz="0"/>
+                    <w:left w:val="none" w:color="FFFFFF" w:sz="0"/>
+                    <w:bottom w:val="none" w:color="FFFFFF" w:sz="0"/>
+                    <w:right w:val="none" w:color="FFFFFF" w:sz="0"/>
+                  </w:tcBorders>
+                  <w:tcMar>
+                    <w:top w:type="dxa" w:w="60"/>
+                    <w:left w:type="dxa" w:w="80"/>
+                    <w:bottom w:type="dxa" w:w="60"/>
+                    <w:right w:type="dxa" w:w="80"/>
+                  </w:tcMar>
+                  <w:vAlign w:val="center"/>
+                </w:tcPr>
+                <w:p>
+                  <w:pPr>
+                    <w:bidi/>
+                    <w:spacing w:after="0" w:before="0" w:line="360" w:lineRule="auto"/>
+                    <w:jc w:val="center"/>
+                  </w:pPr>
+                  <w:r>
+                    <w:rPr>
+                      <w:rFonts w:ascii="Amiri" w:cs="Amiri" w:eastAsia="Amiri" w:hAnsi="Amiri"/>
+                      <w:color w:val="1F3864"/>
+                      <w:sz w:val="24"/>
+                      <w:szCs w:val="24"/>
+                      <w:rtl/>
+                    </w:rPr>
+                    <w:t xml:space="preserve">●</w:t>
+                  </w:r>
+                </w:p>
+              </w:tc>
+              <w:tc>
+                <w:tcPr>
+                  <w:tcW w:type="dxa" w:w="750"/>
+                  <w:tcBorders>
+                    <w:top w:val="none" w:color="FFFFFF" w:sz="0"/>
+                    <w:left w:val="none" w:color="FFFFFF" w:sz="0"/>
+                    <w:bottom w:val="none" w:color="FFFFFF" w:sz="0"/>
+                    <w:right w:val="none" w:color="FFFFFF" w:sz="0"/>
+                  </w:tcBorders>
+                  <w:tcMar>
+                    <w:top w:type="dxa" w:w="60"/>
+                    <w:left w:type="dxa" w:w="80"/>
+                    <w:bottom w:type="dxa" w:w="60"/>
+                    <w:right w:type="dxa" w:w="80"/>
+                  </w:tcMar>
+                  <w:vAlign w:val="center"/>
+                </w:tcPr>
+                <w:p>
+                  <w:pPr>
+                    <w:bidi/>
+                    <w:spacing w:after="60" w:before="60" w:line="360" w:lineRule="auto"/>
+                  </w:pPr>
+                </w:p>
+              </w:tc>
+              <w:tc>
+                <w:tcPr>
+                  <w:tcW w:type="dxa" w:w="330"/>
+                  <w:tcBorders>
+                    <w:top w:val="none" w:color="FFFFFF" w:sz="0"/>
+                    <w:left w:val="none" w:color="FFFFFF" w:sz="0"/>
+                    <w:bottom w:val="none" w:color="FFFFFF" w:sz="0"/>
+                    <w:right w:val="none" w:color="FFFFFF" w:sz="0"/>
+                  </w:tcBorders>
+                  <w:tcMar>
+                    <w:top w:type="dxa" w:w="60"/>
+                    <w:left w:type="dxa" w:w="80"/>
+                    <w:bottom w:type="dxa" w:w="60"/>
+                    <w:right w:type="dxa" w:w="80"/>
+                  </w:tcMar>
+                  <w:vAlign w:val="center"/>
+                </w:tcPr>
+                <w:p>
+                  <w:pPr>
+                    <w:bidi/>
+                    <w:spacing w:after="0" w:before="0" w:line="360" w:lineRule="auto"/>
+                    <w:jc w:val="center"/>
+                  </w:pPr>
+                  <w:r>
+                    <w:rPr>
+                      <w:rFonts w:ascii="Amiri" w:cs="Amiri" w:eastAsia="Amiri" w:hAnsi="Amiri"/>
+                      <w:color w:val="1F3864"/>
+                      <w:sz w:val="24"/>
+                      <w:szCs w:val="24"/>
+                      <w:rtl/>
+                    </w:rPr>
+                    <w:t xml:space="preserve">●</w:t>
+                  </w:r>
+                </w:p>
+              </w:tc>
+              <w:tc>
+                <w:tcPr>
+                  <w:tcW w:type="dxa" w:w="1900"/>
+                  <w:tcBorders>
+                    <w:top w:val="none" w:color="FFFFFF" w:sz="0"/>
+                    <w:left w:val="none" w:color="FFFFFF" w:sz="0"/>
+                    <w:bottom w:val="none" w:color="FFFFFF" w:sz="0"/>
+                    <w:right w:val="none" w:color="FFFFFF" w:sz="0"/>
+                  </w:tcBorders>
+                  <w:tcMar>
+                    <w:top w:type="dxa" w:w="45"/>
+                    <w:left w:type="dxa" w:w="40"/>
+                    <w:bottom w:type="dxa" w:w="45"/>
+                    <w:right w:type="dxa" w:w="40"/>
+                  </w:tcMar>
+                  <w:vAlign w:val="center"/>
+                </w:tcPr>
+                <w:p>
+                  <w:pPr>
+                    <w:bidi/>
+                    <w:spacing w:after="0" w:before="0" w:line="240" w:lineRule="auto"/>
+                    <w:jc w:val="center"/>
+                  </w:pPr>
+                  <w:r>
+                    <w:drawing>
+                      <wp:inline distT="0" distB="0" distL="0" distR="0">
+                        <wp:extent cx="914400" cy="790575"/>
+                        <wp:effectExtent t="0" r="0" b="0" l="0"/>
+                        <wp:docPr id="1" name="" descr="" title=""/>
+                        <wp:cNvGraphicFramePr>
+                          <a:graphicFrameLocks xmlns:a="http://schemas.openxmlformats.org/drawingml/2006/main" noChangeAspect="1"/>
+                        </wp:cNvGraphicFramePr>
+                        <a:graphic xmlns:a="http://schemas.openxmlformats.org/drawingml/2006/main">
+                          <a:graphicData uri="http://schemas.openxmlformats.org/drawingml/2006/picture">
+                            <pic:pic xmlns:pic="http://schemas.openxmlformats.org/drawingml/2006/picture">
+                              <pic:nvPicPr>
+                                <pic:cNvPr id="0" name="" descr=""/>
+                                <pic:cNvPicPr>
+                                  <a:picLocks noChangeAspect="1" noChangeArrowheads="1"/>
+                                </pic:cNvPicPr>
+                              </pic:nvPicPr>
+                              <pic:blipFill>
+                                <a:blip r:embed="rId11" cstate="none"/>
                                 <a:srcRect/>
                                 <a:stretch>
                                   <a:fillRect/>
@@ -3098,18 +3255,49 @@
                     <w:jc w:val="center"/>
                   </w:pPr>
                   <w:r>
+                    <w:drawing>
+                      <wp:inline distT="0" distB="0" distL="0" distR="0">
+                        <wp:extent cx="723900" cy="400050"/>
+                        <wp:effectExtent t="0" r="0" b="0" l="0"/>
+                        <wp:docPr id="1" name="" descr="" title=""/>
+                        <wp:cNvGraphicFramePr>
+                          <a:graphicFrameLocks xmlns:a="http://schemas.openxmlformats.org/drawingml/2006/main" noChangeAspect="1"/>
+                        </wp:cNvGraphicFramePr>
+                        <a:graphic xmlns:a="http://schemas.openxmlformats.org/drawingml/2006/main">
+                          <a:graphicData uri="http://schemas.openxmlformats.org/drawingml/2006/picture">
+                            <pic:pic xmlns:pic="http://schemas.openxmlformats.org/drawingml/2006/picture">
+                              <pic:nvPicPr>
+                                <pic:cNvPr id="0" name="" descr=""/>
+                                <pic:cNvPicPr>
+                                  <a:picLocks noChangeAspect="1" noChangeArrowheads="1"/>
+                                </pic:cNvPicPr>
+                              </pic:nvPicPr>
+                              <pic:blipFill>
+                                <a:blip r:embed="rId7" cstate="none"/>
+                                <a:srcRect/>
+                                <a:stretch>
+                                  <a:fillRect/>
+                                </a:stretch>
+                              </pic:blipFill>
+                              <pic:spPr bwMode="auto">
+                                <a:xfrm>
+                                  <a:off x="0" y="0"/>
+                                  <a:ext cx="723900" cy="400050"/>
+                                </a:xfrm>
+                                <a:prstGeom prst="rect">
+                                  <a:avLst/>
+                                </a:prstGeom>
+                              </pic:spPr>
+                            </pic:pic>
+                          </a:graphicData>
+                        </a:graphic>
+                      </wp:inline>
+                    </w:drawing>
+                  </w:r>
+                  <w:r>
                     <w:rPr>
                       <w:rFonts w:ascii="Amiri" w:cs="Amiri" w:eastAsia="Amiri" w:hAnsi="Amiri"/>
-                      <w:color w:val="808080"/>
-                      <w:sz w:val="32"/>
-                      <w:szCs w:val="32"/>
-                      <w:rtl/>
-                    </w:rPr>
-                    <w:t xml:space="preserve">............</w:t>
-                  </w:r>
-                  <w:r>
-                    <w:rPr>
-                      <w:rFonts w:ascii="Amiri" w:cs="Amiri" w:eastAsia="Amiri" w:hAnsi="Amiri"/>
+                      <w:position w:val="15"/>
                       <w:sz w:val="42"/>
                       <w:szCs w:val="42"/>
                       <w:rtl/>
@@ -3169,6 +3357,7 @@
                   <w:r>
                     <w:rPr>
                       <w:rFonts w:ascii="Amiri" w:cs="Amiri" w:eastAsia="Amiri" w:hAnsi="Amiri"/>
+                      <w:position w:val="15"/>
                       <w:sz w:val="42"/>
                       <w:szCs w:val="42"/>
                       <w:rtl/>
@@ -3176,18 +3365,49 @@
                     <w:t xml:space="preserve">حُـ</w:t>
                   </w:r>
                   <w:r>
+                    <w:drawing>
+                      <wp:inline distT="0" distB="0" distL="0" distR="0">
+                        <wp:extent cx="723900" cy="400050"/>
+                        <wp:effectExtent t="0" r="0" b="0" l="0"/>
+                        <wp:docPr id="1" name="" descr="" title=""/>
+                        <wp:cNvGraphicFramePr>
+                          <a:graphicFrameLocks xmlns:a="http://schemas.openxmlformats.org/drawingml/2006/main" noChangeAspect="1"/>
+                        </wp:cNvGraphicFramePr>
+                        <a:graphic xmlns:a="http://schemas.openxmlformats.org/drawingml/2006/main">
+                          <a:graphicData uri="http://schemas.openxmlformats.org/drawingml/2006/picture">
+                            <pic:pic xmlns:pic="http://schemas.openxmlformats.org/drawingml/2006/picture">
+                              <pic:nvPicPr>
+                                <pic:cNvPr id="0" name="" descr=""/>
+                                <pic:cNvPicPr>
+                                  <a:picLocks noChangeAspect="1" noChangeArrowheads="1"/>
+                                </pic:cNvPicPr>
+                              </pic:nvPicPr>
+                              <pic:blipFill>
+                                <a:blip r:embed="rId7" cstate="none"/>
+                                <a:srcRect/>
+                                <a:stretch>
+                                  <a:fillRect/>
+                                </a:stretch>
+                              </pic:blipFill>
+                              <pic:spPr bwMode="auto">
+                                <a:xfrm>
+                                  <a:off x="0" y="0"/>
+                                  <a:ext cx="723900" cy="400050"/>
+                                </a:xfrm>
+                                <a:prstGeom prst="rect">
+                                  <a:avLst/>
+                                </a:prstGeom>
+                              </pic:spPr>
+                            </pic:pic>
+                          </a:graphicData>
+                        </a:graphic>
+                      </wp:inline>
+                    </w:drawing>
+                  </w:r>
+                  <w:r>
                     <w:rPr>
                       <w:rFonts w:ascii="Amiri" w:cs="Amiri" w:eastAsia="Amiri" w:hAnsi="Amiri"/>
-                      <w:color w:val="808080"/>
-                      <w:sz w:val="32"/>
-                      <w:szCs w:val="32"/>
-                      <w:rtl/>
-                    </w:rPr>
-                    <w:t xml:space="preserve">............</w:t>
-                  </w:r>
-                  <w:r>
-                    <w:rPr>
-                      <w:rFonts w:ascii="Amiri" w:cs="Amiri" w:eastAsia="Amiri" w:hAnsi="Amiri"/>
+                      <w:position w:val="15"/>
                       <w:sz w:val="42"/>
                       <w:szCs w:val="42"/>
                       <w:rtl/>
@@ -3247,6 +3467,7 @@
                   <w:r>
                     <w:rPr>
                       <w:rFonts w:ascii="Amiri" w:cs="Amiri" w:eastAsia="Amiri" w:hAnsi="Amiri"/>
+                      <w:position w:val="15"/>
                       <w:sz w:val="42"/>
                       <w:szCs w:val="42"/>
                       <w:rtl/>
@@ -3254,18 +3475,49 @@
                     <w:t xml:space="preserve">السَّبُّو</w:t>
                   </w:r>
                   <w:r>
+                    <w:drawing>
+                      <wp:inline distT="0" distB="0" distL="0" distR="0">
+                        <wp:extent cx="723900" cy="400050"/>
+                        <wp:effectExtent t="0" r="0" b="0" l="0"/>
+                        <wp:docPr id="1" name="" descr="" title=""/>
+                        <wp:cNvGraphicFramePr>
+                          <a:graphicFrameLocks xmlns:a="http://schemas.openxmlformats.org/drawingml/2006/main" noChangeAspect="1"/>
+                        </wp:cNvGraphicFramePr>
+                        <a:graphic xmlns:a="http://schemas.openxmlformats.org/drawingml/2006/main">
+                          <a:graphicData uri="http://schemas.openxmlformats.org/drawingml/2006/picture">
+                            <pic:pic xmlns:pic="http://schemas.openxmlformats.org/drawingml/2006/picture">
+                              <pic:nvPicPr>
+                                <pic:cNvPr id="0" name="" descr=""/>
+                                <pic:cNvPicPr>
+                                  <a:picLocks noChangeAspect="1" noChangeArrowheads="1"/>
+                                </pic:cNvPicPr>
+                              </pic:nvPicPr>
+                              <pic:blipFill>
+                                <a:blip r:embed="rId7" cstate="none"/>
+                                <a:srcRect/>
+                                <a:stretch>
+                                  <a:fillRect/>
+                                </a:stretch>
+                              </pic:blipFill>
+                              <pic:spPr bwMode="auto">
+                                <a:xfrm>
+                                  <a:off x="0" y="0"/>
+                                  <a:ext cx="723900" cy="400050"/>
+                                </a:xfrm>
+                                <a:prstGeom prst="rect">
+                                  <a:avLst/>
+                                </a:prstGeom>
+                              </pic:spPr>
+                            </pic:pic>
+                          </a:graphicData>
+                        </a:graphic>
+                      </wp:inline>
+                    </w:drawing>
+                  </w:r>
+                  <w:r>
                     <w:rPr>
                       <w:rFonts w:ascii="Amiri" w:cs="Amiri" w:eastAsia="Amiri" w:hAnsi="Amiri"/>
-                      <w:color w:val="808080"/>
-                      <w:sz w:val="32"/>
-                      <w:szCs w:val="32"/>
-                      <w:rtl/>
-                    </w:rPr>
-                    <w:t xml:space="preserve">............</w:t>
-                  </w:r>
-                  <w:r>
-                    <w:rPr>
-                      <w:rFonts w:ascii="Amiri" w:cs="Amiri" w:eastAsia="Amiri" w:hAnsi="Amiri"/>
+                      <w:position w:val="15"/>
                       <w:sz w:val="42"/>
                       <w:szCs w:val="42"/>
                       <w:rtl/>
@@ -3325,6 +3577,7 @@
                   <w:r>
                     <w:rPr>
                       <w:rFonts w:ascii="Amiri" w:cs="Amiri" w:eastAsia="Amiri" w:hAnsi="Amiri"/>
+                      <w:position w:val="15"/>
                       <w:sz w:val="42"/>
                       <w:szCs w:val="42"/>
                       <w:rtl/>
@@ -3332,18 +3585,49 @@
                     <w:t xml:space="preserve">فَـ</w:t>
                   </w:r>
                   <w:r>
+                    <w:drawing>
+                      <wp:inline distT="0" distB="0" distL="0" distR="0">
+                        <wp:extent cx="723900" cy="400050"/>
+                        <wp:effectExtent t="0" r="0" b="0" l="0"/>
+                        <wp:docPr id="1" name="" descr="" title=""/>
+                        <wp:cNvGraphicFramePr>
+                          <a:graphicFrameLocks xmlns:a="http://schemas.openxmlformats.org/drawingml/2006/main" noChangeAspect="1"/>
+                        </wp:cNvGraphicFramePr>
+                        <a:graphic xmlns:a="http://schemas.openxmlformats.org/drawingml/2006/main">
+                          <a:graphicData uri="http://schemas.openxmlformats.org/drawingml/2006/picture">
+                            <pic:pic xmlns:pic="http://schemas.openxmlformats.org/drawingml/2006/picture">
+                              <pic:nvPicPr>
+                                <pic:cNvPr id="0" name="" descr=""/>
+                                <pic:cNvPicPr>
+                                  <a:picLocks noChangeAspect="1" noChangeArrowheads="1"/>
+                                </pic:cNvPicPr>
+                              </pic:nvPicPr>
+                              <pic:blipFill>
+                                <a:blip r:embed="rId7" cstate="none"/>
+                                <a:srcRect/>
+                                <a:stretch>
+                                  <a:fillRect/>
+                                </a:stretch>
+                              </pic:blipFill>
+                              <pic:spPr bwMode="auto">
+                                <a:xfrm>
+                                  <a:off x="0" y="0"/>
+                                  <a:ext cx="723900" cy="400050"/>
+                                </a:xfrm>
+                                <a:prstGeom prst="rect">
+                                  <a:avLst/>
+                                </a:prstGeom>
+                              </pic:spPr>
+                            </pic:pic>
+                          </a:graphicData>
+                        </a:graphic>
+                      </wp:inline>
+                    </w:drawing>
+                  </w:r>
+                  <w:r>
                     <w:rPr>
                       <w:rFonts w:ascii="Amiri" w:cs="Amiri" w:eastAsia="Amiri" w:hAnsi="Amiri"/>
-                      <w:color w:val="808080"/>
-                      <w:sz w:val="32"/>
-                      <w:szCs w:val="32"/>
-                      <w:rtl/>
-                    </w:rPr>
-                    <w:t xml:space="preserve">............</w:t>
-                  </w:r>
-                  <w:r>
-                    <w:rPr>
-                      <w:rFonts w:ascii="Amiri" w:cs="Amiri" w:eastAsia="Amiri" w:hAnsi="Amiri"/>
+                      <w:position w:val="15"/>
                       <w:sz w:val="42"/>
                       <w:szCs w:val="42"/>
                       <w:rtl/>
@@ -3442,6 +3726,7 @@
             <w:r>
               <w:rPr>
                 <w:rFonts w:ascii="Amiri" w:cs="Amiri" w:eastAsia="Amiri" w:hAnsi="Amiri"/>
+                <w:position w:val="15"/>
                 <w:sz w:val="42"/>
                 <w:szCs w:val="42"/>
                 <w:rtl/>
@@ -3449,18 +3734,49 @@
               <w:t xml:space="preserve">رَسَمَتْ </w:t>
             </w:r>
             <w:r>
-              <w:rPr>
-                <w:rFonts w:ascii="Amiri" w:cs="Amiri" w:eastAsia="Amiri" w:hAnsi="Amiri"/>
-                <w:color w:val="808080"/>
-                <w:sz w:val="32"/>
-                <w:szCs w:val="32"/>
-                <w:rtl/>
-              </w:rPr>
-              <w:t xml:space="preserve">..........................</w:t>
+              <w:drawing>
+                <wp:inline distT="0" distB="0" distL="0" distR="0">
+                  <wp:extent cx="1219200" cy="400050"/>
+                  <wp:effectExtent t="0" r="0" b="0" l="0"/>
+                  <wp:docPr id="1" name="" descr="" title=""/>
+                  <wp:cNvGraphicFramePr>
+                    <a:graphicFrameLocks xmlns:a="http://schemas.openxmlformats.org/drawingml/2006/main" noChangeAspect="1"/>
+                  </wp:cNvGraphicFramePr>
+                  <a:graphic xmlns:a="http://schemas.openxmlformats.org/drawingml/2006/main">
+                    <a:graphicData uri="http://schemas.openxmlformats.org/drawingml/2006/picture">
+                      <pic:pic xmlns:pic="http://schemas.openxmlformats.org/drawingml/2006/picture">
+                        <pic:nvPicPr>
+                          <pic:cNvPr id="0" name="" descr=""/>
+                          <pic:cNvPicPr>
+                            <a:picLocks noChangeAspect="1" noChangeArrowheads="1"/>
+                          </pic:cNvPicPr>
+                        </pic:nvPicPr>
+                        <pic:blipFill>
+                          <a:blip r:embed="rId12" cstate="none"/>
+                          <a:srcRect/>
+                          <a:stretch>
+                            <a:fillRect/>
+                          </a:stretch>
+                        </pic:blipFill>
+                        <pic:spPr bwMode="auto">
+                          <a:xfrm>
+                            <a:off x="0" y="0"/>
+                            <a:ext cx="1219200" cy="400050"/>
+                          </a:xfrm>
+                          <a:prstGeom prst="rect">
+                            <a:avLst/>
+                          </a:prstGeom>
+                        </pic:spPr>
+                      </pic:pic>
+                    </a:graphicData>
+                  </a:graphic>
+                </wp:inline>
+              </w:drawing>
             </w:r>
             <w:r>
               <w:rPr>
                 <w:rFonts w:ascii="Amiri" w:cs="Amiri" w:eastAsia="Amiri" w:hAnsi="Amiri"/>
+                <w:position w:val="15"/>
                 <w:sz w:val="42"/>
                 <w:szCs w:val="42"/>
                 <w:rtl/>
@@ -3468,18 +3784,49 @@
               <w:t xml:space="preserve"> </w:t>
             </w:r>
             <w:r>
-              <w:rPr>
-                <w:rFonts w:ascii="Amiri" w:cs="Amiri" w:eastAsia="Amiri" w:hAnsi="Amiri"/>
-                <w:color w:val="808080"/>
-                <w:sz w:val="32"/>
-                <w:szCs w:val="32"/>
-                <w:rtl/>
-              </w:rPr>
-              <w:t xml:space="preserve">..........................</w:t>
+              <w:drawing>
+                <wp:inline distT="0" distB="0" distL="0" distR="0">
+                  <wp:extent cx="1219200" cy="400050"/>
+                  <wp:effectExtent t="0" r="0" b="0" l="0"/>
+                  <wp:docPr id="1" name="" descr="" title=""/>
+                  <wp:cNvGraphicFramePr>
+                    <a:graphicFrameLocks xmlns:a="http://schemas.openxmlformats.org/drawingml/2006/main" noChangeAspect="1"/>
+                  </wp:cNvGraphicFramePr>
+                  <a:graphic xmlns:a="http://schemas.openxmlformats.org/drawingml/2006/main">
+                    <a:graphicData uri="http://schemas.openxmlformats.org/drawingml/2006/picture">
+                      <pic:pic xmlns:pic="http://schemas.openxmlformats.org/drawingml/2006/picture">
+                        <pic:nvPicPr>
+                          <pic:cNvPr id="0" name="" descr=""/>
+                          <pic:cNvPicPr>
+                            <a:picLocks noChangeAspect="1" noChangeArrowheads="1"/>
+                          </pic:cNvPicPr>
+                        </pic:nvPicPr>
+                        <pic:blipFill>
+                          <a:blip r:embed="rId12" cstate="none"/>
+                          <a:srcRect/>
+                          <a:stretch>
+                            <a:fillRect/>
+                          </a:stretch>
+                        </pic:blipFill>
+                        <pic:spPr bwMode="auto">
+                          <a:xfrm>
+                            <a:off x="0" y="0"/>
+                            <a:ext cx="1219200" cy="400050"/>
+                          </a:xfrm>
+                          <a:prstGeom prst="rect">
+                            <a:avLst/>
+                          </a:prstGeom>
+                        </pic:spPr>
+                      </pic:pic>
+                    </a:graphicData>
+                  </a:graphic>
+                </wp:inline>
+              </w:drawing>
             </w:r>
             <w:r>
               <w:rPr>
                 <w:rFonts w:ascii="Amiri" w:cs="Amiri" w:eastAsia="Amiri" w:hAnsi="Amiri"/>
+                <w:position w:val="15"/>
                 <w:sz w:val="42"/>
                 <w:szCs w:val="42"/>
                 <w:rtl/>
@@ -3487,14 +3834,44 @@
               <w:t xml:space="preserve"> عَلَى </w:t>
             </w:r>
             <w:r>
-              <w:rPr>
-                <w:rFonts w:ascii="Amiri" w:cs="Amiri" w:eastAsia="Amiri" w:hAnsi="Amiri"/>
-                <w:color w:val="808080"/>
-                <w:sz w:val="32"/>
-                <w:szCs w:val="32"/>
-                <w:rtl/>
-              </w:rPr>
-              <w:t xml:space="preserve">..........................</w:t>
+              <w:drawing>
+                <wp:inline distT="0" distB="0" distL="0" distR="0">
+                  <wp:extent cx="1219200" cy="400050"/>
+                  <wp:effectExtent t="0" r="0" b="0" l="0"/>
+                  <wp:docPr id="1" name="" descr="" title=""/>
+                  <wp:cNvGraphicFramePr>
+                    <a:graphicFrameLocks xmlns:a="http://schemas.openxmlformats.org/drawingml/2006/main" noChangeAspect="1"/>
+                  </wp:cNvGraphicFramePr>
+                  <a:graphic xmlns:a="http://schemas.openxmlformats.org/drawingml/2006/main">
+                    <a:graphicData uri="http://schemas.openxmlformats.org/drawingml/2006/picture">
+                      <pic:pic xmlns:pic="http://schemas.openxmlformats.org/drawingml/2006/picture">
+                        <pic:nvPicPr>
+                          <pic:cNvPr id="0" name="" descr=""/>
+                          <pic:cNvPicPr>
+                            <a:picLocks noChangeAspect="1" noChangeArrowheads="1"/>
+                          </pic:cNvPicPr>
+                        </pic:nvPicPr>
+                        <pic:blipFill>
+                          <a:blip r:embed="rId12" cstate="none"/>
+                          <a:srcRect/>
+                          <a:stretch>
+                            <a:fillRect/>
+                          </a:stretch>
+                        </pic:blipFill>
+                        <pic:spPr bwMode="auto">
+                          <a:xfrm>
+                            <a:off x="0" y="0"/>
+                            <a:ext cx="1219200" cy="400050"/>
+                          </a:xfrm>
+                          <a:prstGeom prst="rect">
+                            <a:avLst/>
+                          </a:prstGeom>
+                        </pic:spPr>
+                      </pic:pic>
+                    </a:graphicData>
+                  </a:graphic>
+                </wp:inline>
+              </w:drawing>
             </w:r>
           </w:p>
           <w:p>
@@ -3505,6 +3882,7 @@
             <w:r>
               <w:rPr>
                 <w:rFonts w:ascii="Amiri" w:cs="Amiri" w:eastAsia="Amiri" w:hAnsi="Amiri"/>
+                <w:position w:val="15"/>
                 <w:sz w:val="42"/>
                 <w:szCs w:val="42"/>
                 <w:rtl/>
@@ -3512,18 +3890,49 @@
               <w:t xml:space="preserve">وَكَتَبَ مَالِكٌ </w:t>
             </w:r>
             <w:r>
-              <w:rPr>
-                <w:rFonts w:ascii="Amiri" w:cs="Amiri" w:eastAsia="Amiri" w:hAnsi="Amiri"/>
-                <w:color w:val="808080"/>
-                <w:sz w:val="32"/>
-                <w:szCs w:val="32"/>
-                <w:rtl/>
-              </w:rPr>
-              <w:t xml:space="preserve">..........................</w:t>
+              <w:drawing>
+                <wp:inline distT="0" distB="0" distL="0" distR="0">
+                  <wp:extent cx="1219200" cy="400050"/>
+                  <wp:effectExtent t="0" r="0" b="0" l="0"/>
+                  <wp:docPr id="1" name="" descr="" title=""/>
+                  <wp:cNvGraphicFramePr>
+                    <a:graphicFrameLocks xmlns:a="http://schemas.openxmlformats.org/drawingml/2006/main" noChangeAspect="1"/>
+                  </wp:cNvGraphicFramePr>
+                  <a:graphic xmlns:a="http://schemas.openxmlformats.org/drawingml/2006/main">
+                    <a:graphicData uri="http://schemas.openxmlformats.org/drawingml/2006/picture">
+                      <pic:pic xmlns:pic="http://schemas.openxmlformats.org/drawingml/2006/picture">
+                        <pic:nvPicPr>
+                          <pic:cNvPr id="0" name="" descr=""/>
+                          <pic:cNvPicPr>
+                            <a:picLocks noChangeAspect="1" noChangeArrowheads="1"/>
+                          </pic:cNvPicPr>
+                        </pic:nvPicPr>
+                        <pic:blipFill>
+                          <a:blip r:embed="rId12" cstate="none"/>
+                          <a:srcRect/>
+                          <a:stretch>
+                            <a:fillRect/>
+                          </a:stretch>
+                        </pic:blipFill>
+                        <pic:spPr bwMode="auto">
+                          <a:xfrm>
+                            <a:off x="0" y="0"/>
+                            <a:ext cx="1219200" cy="400050"/>
+                          </a:xfrm>
+                          <a:prstGeom prst="rect">
+                            <a:avLst/>
+                          </a:prstGeom>
+                        </pic:spPr>
+                      </pic:pic>
+                    </a:graphicData>
+                  </a:graphic>
+                </wp:inline>
+              </w:drawing>
             </w:r>
             <w:r>
               <w:rPr>
                 <w:rFonts w:ascii="Amiri" w:cs="Amiri" w:eastAsia="Amiri" w:hAnsi="Amiri"/>
+                <w:position w:val="15"/>
                 <w:sz w:val="42"/>
                 <w:szCs w:val="42"/>
                 <w:rtl/>
@@ -3680,329 +4089,6 @@
                                 </pic:cNvPicPr>
                               </pic:nvPicPr>
                               <pic:blipFill>
-                                <a:blip r:embed="rId11" cstate="none"/>
-                                <a:srcRect/>
-                                <a:stretch>
-                                  <a:fillRect/>
-                                </a:stretch>
-                              </pic:blipFill>
-                              <pic:spPr bwMode="auto">
-                                <a:xfrm>
-                                  <a:off x="0" y="0"/>
-                                  <a:ext cx="1000125" cy="666750"/>
-                                </a:xfrm>
-                                <a:prstGeom prst="rect">
-                                  <a:avLst/>
-                                </a:prstGeom>
-                              </pic:spPr>
-                            </pic:pic>
-                          </a:graphicData>
-                        </a:graphic>
-                      </wp:inline>
-                    </w:drawing>
-                  </w:r>
-                </w:p>
-                <w:p>
-                  <w:pPr>
-                    <w:bidi/>
-                    <w:spacing w:after="40" w:before="40" w:line="340" w:lineRule="auto"/>
-                    <w:jc w:val="center"/>
-                  </w:pPr>
-                  <w:r>
-                    <w:rPr>
-                      <w:rFonts w:ascii="Amiri" w:cs="Amiri" w:eastAsia="Amiri" w:hAnsi="Amiri"/>
-                      <w:sz w:val="42"/>
-                      <w:szCs w:val="42"/>
-                      <w:rtl/>
-                    </w:rPr>
-                    <w:t xml:space="preserve">مِسْطَـ</w:t>
-                  </w:r>
-                  <w:r>
-                    <w:rPr>
-                      <w:rFonts w:ascii="Amiri" w:cs="Amiri" w:eastAsia="Amiri" w:hAnsi="Amiri"/>
-                      <w:color w:val="808080"/>
-                      <w:sz w:val="32"/>
-                      <w:szCs w:val="32"/>
-                      <w:rtl/>
-                    </w:rPr>
-                    <w:t xml:space="preserve">............</w:t>
-                  </w:r>
-                  <w:r>
-                    <w:rPr>
-                      <w:rFonts w:ascii="Amiri" w:cs="Amiri" w:eastAsia="Amiri" w:hAnsi="Amiri"/>
-                      <w:sz w:val="42"/>
-                      <w:szCs w:val="42"/>
-                      <w:rtl/>
-                    </w:rPr>
-                    <w:t xml:space="preserve">ةٌ</w:t>
-                  </w:r>
-                </w:p>
-              </w:tc>
-              <w:tc>
-                <w:tcPr>
-                  <w:tcW w:type="dxa" w:w="300"/>
-                  <w:tcBorders>
-                    <w:top w:val="none" w:color="FFFFFF" w:sz="0"/>
-                    <w:left w:val="none" w:color="FFFFFF" w:sz="0"/>
-                    <w:bottom w:val="none" w:color="FFFFFF" w:sz="0"/>
-                    <w:right w:val="none" w:color="FFFFFF" w:sz="0"/>
-                  </w:tcBorders>
-                  <w:tcMar>
-                    <w:top w:type="dxa" w:w="60"/>
-                    <w:left w:type="dxa" w:w="80"/>
-                    <w:bottom w:type="dxa" w:w="60"/>
-                    <w:right w:type="dxa" w:w="80"/>
-                  </w:tcMar>
-                  <w:vAlign w:val="center"/>
-                </w:tcPr>
-                <w:p>
-                  <w:pPr>
-                    <w:bidi/>
-                    <w:spacing w:after="60" w:before="60" w:line="360" w:lineRule="auto"/>
-                  </w:pPr>
-                </w:p>
-              </w:tc>
-              <w:tc>
-                <w:tcPr>
-                  <w:tcW w:type="dxa" w:w="2250"/>
-                  <w:tcBorders>
-                    <w:top w:val="single" w:color="595959" w:sz="10"/>
-                    <w:left w:val="single" w:color="595959" w:sz="10"/>
-                    <w:bottom w:val="single" w:color="595959" w:sz="10"/>
-                    <w:right w:val="single" w:color="595959" w:sz="10"/>
-                  </w:tcBorders>
-                  <w:tcMar>
-                    <w:top w:type="dxa" w:w="60"/>
-                    <w:left w:type="dxa" w:w="80"/>
-                    <w:bottom w:type="dxa" w:w="60"/>
-                    <w:right w:type="dxa" w:w="80"/>
-                  </w:tcMar>
-                  <w:vAlign w:val="bottom"/>
-                </w:tcPr>
-                <w:p>
-                  <w:pPr>
-                    <w:bidi/>
-                    <w:spacing w:after="0" w:before="30" w:line="240" w:lineRule="auto"/>
-                    <w:jc w:val="center"/>
-                  </w:pPr>
-                </w:p>
-                <w:p>
-                  <w:pPr>
-                    <w:bidi/>
-                    <w:spacing w:after="40" w:before="40" w:line="340" w:lineRule="auto"/>
-                    <w:jc w:val="center"/>
-                  </w:pPr>
-                  <w:r>
-                    <w:rPr>
-                      <w:rFonts w:ascii="Amiri" w:cs="Amiri" w:eastAsia="Amiri" w:hAnsi="Amiri"/>
-                      <w:sz w:val="42"/>
-                      <w:szCs w:val="42"/>
-                      <w:rtl/>
-                    </w:rPr>
-                    <w:t xml:space="preserve">اِشْتَـ</w:t>
-                  </w:r>
-                  <w:r>
-                    <w:rPr>
-                      <w:rFonts w:ascii="Amiri" w:cs="Amiri" w:eastAsia="Amiri" w:hAnsi="Amiri"/>
-                      <w:color w:val="808080"/>
-                      <w:sz w:val="32"/>
-                      <w:szCs w:val="32"/>
-                      <w:rtl/>
-                    </w:rPr>
-                    <w:t xml:space="preserve">............</w:t>
-                  </w:r>
-                </w:p>
-              </w:tc>
-              <w:tc>
-                <w:tcPr>
-                  <w:tcW w:type="dxa" w:w="300"/>
-                  <w:tcBorders>
-                    <w:top w:val="none" w:color="FFFFFF" w:sz="0"/>
-                    <w:left w:val="none" w:color="FFFFFF" w:sz="0"/>
-                    <w:bottom w:val="none" w:color="FFFFFF" w:sz="0"/>
-                    <w:right w:val="none" w:color="FFFFFF" w:sz="0"/>
-                  </w:tcBorders>
-                  <w:tcMar>
-                    <w:top w:type="dxa" w:w="60"/>
-                    <w:left w:type="dxa" w:w="80"/>
-                    <w:bottom w:type="dxa" w:w="60"/>
-                    <w:right w:type="dxa" w:w="80"/>
-                  </w:tcMar>
-                  <w:vAlign w:val="center"/>
-                </w:tcPr>
-                <w:p>
-                  <w:pPr>
-                    <w:bidi/>
-                    <w:spacing w:after="60" w:before="60" w:line="360" w:lineRule="auto"/>
-                  </w:pPr>
-                </w:p>
-              </w:tc>
-              <w:tc>
-                <w:tcPr>
-                  <w:tcW w:type="dxa" w:w="2250"/>
-                  <w:tcBorders>
-                    <w:top w:val="single" w:color="595959" w:sz="10"/>
-                    <w:left w:val="single" w:color="595959" w:sz="10"/>
-                    <w:bottom w:val="single" w:color="595959" w:sz="10"/>
-                    <w:right w:val="single" w:color="595959" w:sz="10"/>
-                  </w:tcBorders>
-                  <w:tcMar>
-                    <w:top w:type="dxa" w:w="60"/>
-                    <w:left w:type="dxa" w:w="80"/>
-                    <w:bottom w:type="dxa" w:w="60"/>
-                    <w:right w:type="dxa" w:w="80"/>
-                  </w:tcMar>
-                  <w:vAlign w:val="bottom"/>
-                </w:tcPr>
-                <w:p>
-                  <w:pPr>
-                    <w:bidi/>
-                    <w:spacing w:after="0" w:before="30" w:line="240" w:lineRule="auto"/>
-                    <w:jc w:val="center"/>
-                  </w:pPr>
-                  <w:r>
-                    <w:drawing>
-                      <wp:inline distT="0" distB="0" distL="0" distR="0">
-                        <wp:extent cx="514350" cy="666750"/>
-                        <wp:effectExtent t="0" r="0" b="0" l="0"/>
-                        <wp:docPr id="1" name="" descr="" title=""/>
-                        <wp:cNvGraphicFramePr>
-                          <a:graphicFrameLocks xmlns:a="http://schemas.openxmlformats.org/drawingml/2006/main" noChangeAspect="1"/>
-                        </wp:cNvGraphicFramePr>
-                        <a:graphic xmlns:a="http://schemas.openxmlformats.org/drawingml/2006/main">
-                          <a:graphicData uri="http://schemas.openxmlformats.org/drawingml/2006/picture">
-                            <pic:pic xmlns:pic="http://schemas.openxmlformats.org/drawingml/2006/picture">
-                              <pic:nvPicPr>
-                                <pic:cNvPr id="0" name="" descr=""/>
-                                <pic:cNvPicPr>
-                                  <a:picLocks noChangeAspect="1" noChangeArrowheads="1"/>
-                                </pic:cNvPicPr>
-                              </pic:nvPicPr>
-                              <pic:blipFill>
-                                <a:blip r:embed="rId12" cstate="none"/>
-                                <a:srcRect/>
-                                <a:stretch>
-                                  <a:fillRect/>
-                                </a:stretch>
-                              </pic:blipFill>
-                              <pic:spPr bwMode="auto">
-                                <a:xfrm>
-                                  <a:off x="0" y="0"/>
-                                  <a:ext cx="514350" cy="666750"/>
-                                </a:xfrm>
-                                <a:prstGeom prst="rect">
-                                  <a:avLst/>
-                                </a:prstGeom>
-                              </pic:spPr>
-                            </pic:pic>
-                          </a:graphicData>
-                        </a:graphic>
-                      </wp:inline>
-                    </w:drawing>
-                  </w:r>
-                </w:p>
-                <w:p>
-                  <w:pPr>
-                    <w:bidi/>
-                    <w:spacing w:after="40" w:before="40" w:line="340" w:lineRule="auto"/>
-                    <w:jc w:val="center"/>
-                  </w:pPr>
-                  <w:r>
-                    <w:rPr>
-                      <w:rFonts w:ascii="Amiri" w:cs="Amiri" w:eastAsia="Amiri" w:hAnsi="Amiri"/>
-                      <w:sz w:val="42"/>
-                      <w:szCs w:val="42"/>
-                      <w:rtl/>
-                    </w:rPr>
-                    <w:t xml:space="preserve">كَـ</w:t>
-                  </w:r>
-                  <w:r>
-                    <w:rPr>
-                      <w:rFonts w:ascii="Amiri" w:cs="Amiri" w:eastAsia="Amiri" w:hAnsi="Amiri"/>
-                      <w:color w:val="808080"/>
-                      <w:sz w:val="32"/>
-                      <w:szCs w:val="32"/>
-                      <w:rtl/>
-                    </w:rPr>
-                    <w:t xml:space="preserve">............</w:t>
-                  </w:r>
-                  <w:r>
-                    <w:rPr>
-                      <w:rFonts w:ascii="Amiri" w:cs="Amiri" w:eastAsia="Amiri" w:hAnsi="Amiri"/>
-                      <w:sz w:val="42"/>
-                      <w:szCs w:val="42"/>
-                      <w:rtl/>
-                    </w:rPr>
-                    <w:t xml:space="preserve">ـمُ</w:t>
-                  </w:r>
-                </w:p>
-              </w:tc>
-              <w:tc>
-                <w:tcPr>
-                  <w:tcW w:type="dxa" w:w="300"/>
-                  <w:tcBorders>
-                    <w:top w:val="none" w:color="FFFFFF" w:sz="0"/>
-                    <w:left w:val="none" w:color="FFFFFF" w:sz="0"/>
-                    <w:bottom w:val="none" w:color="FFFFFF" w:sz="0"/>
-                    <w:right w:val="none" w:color="FFFFFF" w:sz="0"/>
-                  </w:tcBorders>
-                  <w:tcMar>
-                    <w:top w:type="dxa" w:w="60"/>
-                    <w:left w:type="dxa" w:w="80"/>
-                    <w:bottom w:type="dxa" w:w="60"/>
-                    <w:right w:type="dxa" w:w="80"/>
-                  </w:tcMar>
-                  <w:vAlign w:val="center"/>
-                </w:tcPr>
-                <w:p>
-                  <w:pPr>
-                    <w:bidi/>
-                    <w:spacing w:after="60" w:before="60" w:line="360" w:lineRule="auto"/>
-                  </w:pPr>
-                </w:p>
-              </w:tc>
-              <w:tc>
-                <w:tcPr>
-                  <w:tcW w:type="dxa" w:w="2250"/>
-                  <w:tcBorders>
-                    <w:top w:val="single" w:color="595959" w:sz="10"/>
-                    <w:left w:val="single" w:color="595959" w:sz="10"/>
-                    <w:bottom w:val="single" w:color="595959" w:sz="10"/>
-                    <w:right w:val="single" w:color="595959" w:sz="10"/>
-                  </w:tcBorders>
-                  <w:tcMar>
-                    <w:top w:type="dxa" w:w="60"/>
-                    <w:left w:type="dxa" w:w="80"/>
-                    <w:bottom w:type="dxa" w:w="60"/>
-                    <w:right w:type="dxa" w:w="80"/>
-                  </w:tcMar>
-                  <w:vAlign w:val="bottom"/>
-                </w:tcPr>
-                <w:p>
-                  <w:pPr>
-                    <w:bidi/>
-                    <w:spacing w:after="0" w:before="30" w:line="240" w:lineRule="auto"/>
-                    <w:jc w:val="center"/>
-                  </w:pPr>
-                  <w:r>
-                    <w:drawing>
-                      <wp:inline distT="0" distB="0" distL="0" distR="0">
-                        <wp:extent cx="1000125" cy="666750"/>
-                        <wp:effectExtent t="0" r="0" b="0" l="0"/>
-                        <wp:docPr id="1" name="" descr="" title=""/>
-                        <wp:cNvGraphicFramePr>
-                          <a:graphicFrameLocks xmlns:a="http://schemas.openxmlformats.org/drawingml/2006/main" noChangeAspect="1"/>
-                        </wp:cNvGraphicFramePr>
-                        <a:graphic xmlns:a="http://schemas.openxmlformats.org/drawingml/2006/main">
-                          <a:graphicData uri="http://schemas.openxmlformats.org/drawingml/2006/picture">
-                            <pic:pic xmlns:pic="http://schemas.openxmlformats.org/drawingml/2006/picture">
-                              <pic:nvPicPr>
-                                <pic:cNvPr id="0" name="" descr=""/>
-                                <pic:cNvPicPr>
-                                  <a:picLocks noChangeAspect="1" noChangeArrowheads="1"/>
-                                </pic:cNvPicPr>
-                              </pic:nvPicPr>
-                              <pic:blipFill>
                                 <a:blip r:embed="rId13" cstate="none"/>
                                 <a:srcRect/>
                                 <a:stretch>
@@ -4034,6 +4120,425 @@
                   <w:r>
                     <w:rPr>
                       <w:rFonts w:ascii="Amiri" w:cs="Amiri" w:eastAsia="Amiri" w:hAnsi="Amiri"/>
+                      <w:position w:val="15"/>
+                      <w:sz w:val="42"/>
+                      <w:szCs w:val="42"/>
+                      <w:rtl/>
+                    </w:rPr>
+                    <w:t xml:space="preserve">مِسْطَـ</w:t>
+                  </w:r>
+                  <w:r>
+                    <w:drawing>
+                      <wp:inline distT="0" distB="0" distL="0" distR="0">
+                        <wp:extent cx="723900" cy="400050"/>
+                        <wp:effectExtent t="0" r="0" b="0" l="0"/>
+                        <wp:docPr id="1" name="" descr="" title=""/>
+                        <wp:cNvGraphicFramePr>
+                          <a:graphicFrameLocks xmlns:a="http://schemas.openxmlformats.org/drawingml/2006/main" noChangeAspect="1"/>
+                        </wp:cNvGraphicFramePr>
+                        <a:graphic xmlns:a="http://schemas.openxmlformats.org/drawingml/2006/main">
+                          <a:graphicData uri="http://schemas.openxmlformats.org/drawingml/2006/picture">
+                            <pic:pic xmlns:pic="http://schemas.openxmlformats.org/drawingml/2006/picture">
+                              <pic:nvPicPr>
+                                <pic:cNvPr id="0" name="" descr=""/>
+                                <pic:cNvPicPr>
+                                  <a:picLocks noChangeAspect="1" noChangeArrowheads="1"/>
+                                </pic:cNvPicPr>
+                              </pic:nvPicPr>
+                              <pic:blipFill>
+                                <a:blip r:embed="rId7" cstate="none"/>
+                                <a:srcRect/>
+                                <a:stretch>
+                                  <a:fillRect/>
+                                </a:stretch>
+                              </pic:blipFill>
+                              <pic:spPr bwMode="auto">
+                                <a:xfrm>
+                                  <a:off x="0" y="0"/>
+                                  <a:ext cx="723900" cy="400050"/>
+                                </a:xfrm>
+                                <a:prstGeom prst="rect">
+                                  <a:avLst/>
+                                </a:prstGeom>
+                              </pic:spPr>
+                            </pic:pic>
+                          </a:graphicData>
+                        </a:graphic>
+                      </wp:inline>
+                    </w:drawing>
+                  </w:r>
+                  <w:r>
+                    <w:rPr>
+                      <w:rFonts w:ascii="Amiri" w:cs="Amiri" w:eastAsia="Amiri" w:hAnsi="Amiri"/>
+                      <w:position w:val="15"/>
+                      <w:sz w:val="42"/>
+                      <w:szCs w:val="42"/>
+                      <w:rtl/>
+                    </w:rPr>
+                    <w:t xml:space="preserve">ةٌ</w:t>
+                  </w:r>
+                </w:p>
+              </w:tc>
+              <w:tc>
+                <w:tcPr>
+                  <w:tcW w:type="dxa" w:w="300"/>
+                  <w:tcBorders>
+                    <w:top w:val="none" w:color="FFFFFF" w:sz="0"/>
+                    <w:left w:val="none" w:color="FFFFFF" w:sz="0"/>
+                    <w:bottom w:val="none" w:color="FFFFFF" w:sz="0"/>
+                    <w:right w:val="none" w:color="FFFFFF" w:sz="0"/>
+                  </w:tcBorders>
+                  <w:tcMar>
+                    <w:top w:type="dxa" w:w="60"/>
+                    <w:left w:type="dxa" w:w="80"/>
+                    <w:bottom w:type="dxa" w:w="60"/>
+                    <w:right w:type="dxa" w:w="80"/>
+                  </w:tcMar>
+                  <w:vAlign w:val="center"/>
+                </w:tcPr>
+                <w:p>
+                  <w:pPr>
+                    <w:bidi/>
+                    <w:spacing w:after="60" w:before="60" w:line="360" w:lineRule="auto"/>
+                  </w:pPr>
+                </w:p>
+              </w:tc>
+              <w:tc>
+                <w:tcPr>
+                  <w:tcW w:type="dxa" w:w="2250"/>
+                  <w:tcBorders>
+                    <w:top w:val="single" w:color="595959" w:sz="10"/>
+                    <w:left w:val="single" w:color="595959" w:sz="10"/>
+                    <w:bottom w:val="single" w:color="595959" w:sz="10"/>
+                    <w:right w:val="single" w:color="595959" w:sz="10"/>
+                  </w:tcBorders>
+                  <w:tcMar>
+                    <w:top w:type="dxa" w:w="60"/>
+                    <w:left w:type="dxa" w:w="80"/>
+                    <w:bottom w:type="dxa" w:w="60"/>
+                    <w:right w:type="dxa" w:w="80"/>
+                  </w:tcMar>
+                  <w:vAlign w:val="bottom"/>
+                </w:tcPr>
+                <w:p>
+                  <w:pPr>
+                    <w:bidi/>
+                    <w:spacing w:after="0" w:before="30" w:line="240" w:lineRule="auto"/>
+                    <w:jc w:val="center"/>
+                  </w:pPr>
+                </w:p>
+                <w:p>
+                  <w:pPr>
+                    <w:bidi/>
+                    <w:spacing w:after="40" w:before="40" w:line="340" w:lineRule="auto"/>
+                    <w:jc w:val="center"/>
+                  </w:pPr>
+                  <w:r>
+                    <w:rPr>
+                      <w:rFonts w:ascii="Amiri" w:cs="Amiri" w:eastAsia="Amiri" w:hAnsi="Amiri"/>
+                      <w:position w:val="15"/>
+                      <w:sz w:val="42"/>
+                      <w:szCs w:val="42"/>
+                      <w:rtl/>
+                    </w:rPr>
+                    <w:t xml:space="preserve">اِشْتَـ</w:t>
+                  </w:r>
+                  <w:r>
+                    <w:drawing>
+                      <wp:inline distT="0" distB="0" distL="0" distR="0">
+                        <wp:extent cx="723900" cy="400050"/>
+                        <wp:effectExtent t="0" r="0" b="0" l="0"/>
+                        <wp:docPr id="1" name="" descr="" title=""/>
+                        <wp:cNvGraphicFramePr>
+                          <a:graphicFrameLocks xmlns:a="http://schemas.openxmlformats.org/drawingml/2006/main" noChangeAspect="1"/>
+                        </wp:cNvGraphicFramePr>
+                        <a:graphic xmlns:a="http://schemas.openxmlformats.org/drawingml/2006/main">
+                          <a:graphicData uri="http://schemas.openxmlformats.org/drawingml/2006/picture">
+                            <pic:pic xmlns:pic="http://schemas.openxmlformats.org/drawingml/2006/picture">
+                              <pic:nvPicPr>
+                                <pic:cNvPr id="0" name="" descr=""/>
+                                <pic:cNvPicPr>
+                                  <a:picLocks noChangeAspect="1" noChangeArrowheads="1"/>
+                                </pic:cNvPicPr>
+                              </pic:nvPicPr>
+                              <pic:blipFill>
+                                <a:blip r:embed="rId7" cstate="none"/>
+                                <a:srcRect/>
+                                <a:stretch>
+                                  <a:fillRect/>
+                                </a:stretch>
+                              </pic:blipFill>
+                              <pic:spPr bwMode="auto">
+                                <a:xfrm>
+                                  <a:off x="0" y="0"/>
+                                  <a:ext cx="723900" cy="400050"/>
+                                </a:xfrm>
+                                <a:prstGeom prst="rect">
+                                  <a:avLst/>
+                                </a:prstGeom>
+                              </pic:spPr>
+                            </pic:pic>
+                          </a:graphicData>
+                        </a:graphic>
+                      </wp:inline>
+                    </w:drawing>
+                  </w:r>
+                </w:p>
+              </w:tc>
+              <w:tc>
+                <w:tcPr>
+                  <w:tcW w:type="dxa" w:w="300"/>
+                  <w:tcBorders>
+                    <w:top w:val="none" w:color="FFFFFF" w:sz="0"/>
+                    <w:left w:val="none" w:color="FFFFFF" w:sz="0"/>
+                    <w:bottom w:val="none" w:color="FFFFFF" w:sz="0"/>
+                    <w:right w:val="none" w:color="FFFFFF" w:sz="0"/>
+                  </w:tcBorders>
+                  <w:tcMar>
+                    <w:top w:type="dxa" w:w="60"/>
+                    <w:left w:type="dxa" w:w="80"/>
+                    <w:bottom w:type="dxa" w:w="60"/>
+                    <w:right w:type="dxa" w:w="80"/>
+                  </w:tcMar>
+                  <w:vAlign w:val="center"/>
+                </w:tcPr>
+                <w:p>
+                  <w:pPr>
+                    <w:bidi/>
+                    <w:spacing w:after="60" w:before="60" w:line="360" w:lineRule="auto"/>
+                  </w:pPr>
+                </w:p>
+              </w:tc>
+              <w:tc>
+                <w:tcPr>
+                  <w:tcW w:type="dxa" w:w="2250"/>
+                  <w:tcBorders>
+                    <w:top w:val="single" w:color="595959" w:sz="10"/>
+                    <w:left w:val="single" w:color="595959" w:sz="10"/>
+                    <w:bottom w:val="single" w:color="595959" w:sz="10"/>
+                    <w:right w:val="single" w:color="595959" w:sz="10"/>
+                  </w:tcBorders>
+                  <w:tcMar>
+                    <w:top w:type="dxa" w:w="60"/>
+                    <w:left w:type="dxa" w:w="80"/>
+                    <w:bottom w:type="dxa" w:w="60"/>
+                    <w:right w:type="dxa" w:w="80"/>
+                  </w:tcMar>
+                  <w:vAlign w:val="bottom"/>
+                </w:tcPr>
+                <w:p>
+                  <w:pPr>
+                    <w:bidi/>
+                    <w:spacing w:after="0" w:before="30" w:line="240" w:lineRule="auto"/>
+                    <w:jc w:val="center"/>
+                  </w:pPr>
+                  <w:r>
+                    <w:drawing>
+                      <wp:inline distT="0" distB="0" distL="0" distR="0">
+                        <wp:extent cx="514350" cy="666750"/>
+                        <wp:effectExtent t="0" r="0" b="0" l="0"/>
+                        <wp:docPr id="1" name="" descr="" title=""/>
+                        <wp:cNvGraphicFramePr>
+                          <a:graphicFrameLocks xmlns:a="http://schemas.openxmlformats.org/drawingml/2006/main" noChangeAspect="1"/>
+                        </wp:cNvGraphicFramePr>
+                        <a:graphic xmlns:a="http://schemas.openxmlformats.org/drawingml/2006/main">
+                          <a:graphicData uri="http://schemas.openxmlformats.org/drawingml/2006/picture">
+                            <pic:pic xmlns:pic="http://schemas.openxmlformats.org/drawingml/2006/picture">
+                              <pic:nvPicPr>
+                                <pic:cNvPr id="0" name="" descr=""/>
+                                <pic:cNvPicPr>
+                                  <a:picLocks noChangeAspect="1" noChangeArrowheads="1"/>
+                                </pic:cNvPicPr>
+                              </pic:nvPicPr>
+                              <pic:blipFill>
+                                <a:blip r:embed="rId14" cstate="none"/>
+                                <a:srcRect/>
+                                <a:stretch>
+                                  <a:fillRect/>
+                                </a:stretch>
+                              </pic:blipFill>
+                              <pic:spPr bwMode="auto">
+                                <a:xfrm>
+                                  <a:off x="0" y="0"/>
+                                  <a:ext cx="514350" cy="666750"/>
+                                </a:xfrm>
+                                <a:prstGeom prst="rect">
+                                  <a:avLst/>
+                                </a:prstGeom>
+                              </pic:spPr>
+                            </pic:pic>
+                          </a:graphicData>
+                        </a:graphic>
+                      </wp:inline>
+                    </w:drawing>
+                  </w:r>
+                </w:p>
+                <w:p>
+                  <w:pPr>
+                    <w:bidi/>
+                    <w:spacing w:after="40" w:before="40" w:line="340" w:lineRule="auto"/>
+                    <w:jc w:val="center"/>
+                  </w:pPr>
+                  <w:r>
+                    <w:rPr>
+                      <w:rFonts w:ascii="Amiri" w:cs="Amiri" w:eastAsia="Amiri" w:hAnsi="Amiri"/>
+                      <w:position w:val="15"/>
+                      <w:sz w:val="42"/>
+                      <w:szCs w:val="42"/>
+                      <w:rtl/>
+                    </w:rPr>
+                    <w:t xml:space="preserve">كَـ</w:t>
+                  </w:r>
+                  <w:r>
+                    <w:drawing>
+                      <wp:inline distT="0" distB="0" distL="0" distR="0">
+                        <wp:extent cx="723900" cy="400050"/>
+                        <wp:effectExtent t="0" r="0" b="0" l="0"/>
+                        <wp:docPr id="1" name="" descr="" title=""/>
+                        <wp:cNvGraphicFramePr>
+                          <a:graphicFrameLocks xmlns:a="http://schemas.openxmlformats.org/drawingml/2006/main" noChangeAspect="1"/>
+                        </wp:cNvGraphicFramePr>
+                        <a:graphic xmlns:a="http://schemas.openxmlformats.org/drawingml/2006/main">
+                          <a:graphicData uri="http://schemas.openxmlformats.org/drawingml/2006/picture">
+                            <pic:pic xmlns:pic="http://schemas.openxmlformats.org/drawingml/2006/picture">
+                              <pic:nvPicPr>
+                                <pic:cNvPr id="0" name="" descr=""/>
+                                <pic:cNvPicPr>
+                                  <a:picLocks noChangeAspect="1" noChangeArrowheads="1"/>
+                                </pic:cNvPicPr>
+                              </pic:nvPicPr>
+                              <pic:blipFill>
+                                <a:blip r:embed="rId7" cstate="none"/>
+                                <a:srcRect/>
+                                <a:stretch>
+                                  <a:fillRect/>
+                                </a:stretch>
+                              </pic:blipFill>
+                              <pic:spPr bwMode="auto">
+                                <a:xfrm>
+                                  <a:off x="0" y="0"/>
+                                  <a:ext cx="723900" cy="400050"/>
+                                </a:xfrm>
+                                <a:prstGeom prst="rect">
+                                  <a:avLst/>
+                                </a:prstGeom>
+                              </pic:spPr>
+                            </pic:pic>
+                          </a:graphicData>
+                        </a:graphic>
+                      </wp:inline>
+                    </w:drawing>
+                  </w:r>
+                  <w:r>
+                    <w:rPr>
+                      <w:rFonts w:ascii="Amiri" w:cs="Amiri" w:eastAsia="Amiri" w:hAnsi="Amiri"/>
+                      <w:position w:val="15"/>
+                      <w:sz w:val="42"/>
+                      <w:szCs w:val="42"/>
+                      <w:rtl/>
+                    </w:rPr>
+                    <w:t xml:space="preserve">ـمُ</w:t>
+                  </w:r>
+                </w:p>
+              </w:tc>
+              <w:tc>
+                <w:tcPr>
+                  <w:tcW w:type="dxa" w:w="300"/>
+                  <w:tcBorders>
+                    <w:top w:val="none" w:color="FFFFFF" w:sz="0"/>
+                    <w:left w:val="none" w:color="FFFFFF" w:sz="0"/>
+                    <w:bottom w:val="none" w:color="FFFFFF" w:sz="0"/>
+                    <w:right w:val="none" w:color="FFFFFF" w:sz="0"/>
+                  </w:tcBorders>
+                  <w:tcMar>
+                    <w:top w:type="dxa" w:w="60"/>
+                    <w:left w:type="dxa" w:w="80"/>
+                    <w:bottom w:type="dxa" w:w="60"/>
+                    <w:right w:type="dxa" w:w="80"/>
+                  </w:tcMar>
+                  <w:vAlign w:val="center"/>
+                </w:tcPr>
+                <w:p>
+                  <w:pPr>
+                    <w:bidi/>
+                    <w:spacing w:after="60" w:before="60" w:line="360" w:lineRule="auto"/>
+                  </w:pPr>
+                </w:p>
+              </w:tc>
+              <w:tc>
+                <w:tcPr>
+                  <w:tcW w:type="dxa" w:w="2250"/>
+                  <w:tcBorders>
+                    <w:top w:val="single" w:color="595959" w:sz="10"/>
+                    <w:left w:val="single" w:color="595959" w:sz="10"/>
+                    <w:bottom w:val="single" w:color="595959" w:sz="10"/>
+                    <w:right w:val="single" w:color="595959" w:sz="10"/>
+                  </w:tcBorders>
+                  <w:tcMar>
+                    <w:top w:type="dxa" w:w="60"/>
+                    <w:left w:type="dxa" w:w="80"/>
+                    <w:bottom w:type="dxa" w:w="60"/>
+                    <w:right w:type="dxa" w:w="80"/>
+                  </w:tcMar>
+                  <w:vAlign w:val="bottom"/>
+                </w:tcPr>
+                <w:p>
+                  <w:pPr>
+                    <w:bidi/>
+                    <w:spacing w:after="0" w:before="30" w:line="240" w:lineRule="auto"/>
+                    <w:jc w:val="center"/>
+                  </w:pPr>
+                  <w:r>
+                    <w:drawing>
+                      <wp:inline distT="0" distB="0" distL="0" distR="0">
+                        <wp:extent cx="1000125" cy="666750"/>
+                        <wp:effectExtent t="0" r="0" b="0" l="0"/>
+                        <wp:docPr id="1" name="" descr="" title=""/>
+                        <wp:cNvGraphicFramePr>
+                          <a:graphicFrameLocks xmlns:a="http://schemas.openxmlformats.org/drawingml/2006/main" noChangeAspect="1"/>
+                        </wp:cNvGraphicFramePr>
+                        <a:graphic xmlns:a="http://schemas.openxmlformats.org/drawingml/2006/main">
+                          <a:graphicData uri="http://schemas.openxmlformats.org/drawingml/2006/picture">
+                            <pic:pic xmlns:pic="http://schemas.openxmlformats.org/drawingml/2006/picture">
+                              <pic:nvPicPr>
+                                <pic:cNvPr id="0" name="" descr=""/>
+                                <pic:cNvPicPr>
+                                  <a:picLocks noChangeAspect="1" noChangeArrowheads="1"/>
+                                </pic:cNvPicPr>
+                              </pic:nvPicPr>
+                              <pic:blipFill>
+                                <a:blip r:embed="rId15" cstate="none"/>
+                                <a:srcRect/>
+                                <a:stretch>
+                                  <a:fillRect/>
+                                </a:stretch>
+                              </pic:blipFill>
+                              <pic:spPr bwMode="auto">
+                                <a:xfrm>
+                                  <a:off x="0" y="0"/>
+                                  <a:ext cx="1000125" cy="666750"/>
+                                </a:xfrm>
+                                <a:prstGeom prst="rect">
+                                  <a:avLst/>
+                                </a:prstGeom>
+                              </pic:spPr>
+                            </pic:pic>
+                          </a:graphicData>
+                        </a:graphic>
+                      </wp:inline>
+                    </w:drawing>
+                  </w:r>
+                </w:p>
+                <w:p>
+                  <w:pPr>
+                    <w:bidi/>
+                    <w:spacing w:after="40" w:before="40" w:line="340" w:lineRule="auto"/>
+                    <w:jc w:val="center"/>
+                  </w:pPr>
+                  <w:r>
+                    <w:rPr>
+                      <w:rFonts w:ascii="Amiri" w:cs="Amiri" w:eastAsia="Amiri" w:hAnsi="Amiri"/>
+                      <w:position w:val="15"/>
                       <w:sz w:val="42"/>
                       <w:szCs w:val="42"/>
                       <w:rtl/>
@@ -4041,18 +4546,49 @@
                     <w:t xml:space="preserve">مِبْـ</w:t>
                   </w:r>
                   <w:r>
+                    <w:drawing>
+                      <wp:inline distT="0" distB="0" distL="0" distR="0">
+                        <wp:extent cx="723900" cy="400050"/>
+                        <wp:effectExtent t="0" r="0" b="0" l="0"/>
+                        <wp:docPr id="1" name="" descr="" title=""/>
+                        <wp:cNvGraphicFramePr>
+                          <a:graphicFrameLocks xmlns:a="http://schemas.openxmlformats.org/drawingml/2006/main" noChangeAspect="1"/>
+                        </wp:cNvGraphicFramePr>
+                        <a:graphic xmlns:a="http://schemas.openxmlformats.org/drawingml/2006/main">
+                          <a:graphicData uri="http://schemas.openxmlformats.org/drawingml/2006/picture">
+                            <pic:pic xmlns:pic="http://schemas.openxmlformats.org/drawingml/2006/picture">
+                              <pic:nvPicPr>
+                                <pic:cNvPr id="0" name="" descr=""/>
+                                <pic:cNvPicPr>
+                                  <a:picLocks noChangeAspect="1" noChangeArrowheads="1"/>
+                                </pic:cNvPicPr>
+                              </pic:nvPicPr>
+                              <pic:blipFill>
+                                <a:blip r:embed="rId7" cstate="none"/>
+                                <a:srcRect/>
+                                <a:stretch>
+                                  <a:fillRect/>
+                                </a:stretch>
+                              </pic:blipFill>
+                              <pic:spPr bwMode="auto">
+                                <a:xfrm>
+                                  <a:off x="0" y="0"/>
+                                  <a:ext cx="723900" cy="400050"/>
+                                </a:xfrm>
+                                <a:prstGeom prst="rect">
+                                  <a:avLst/>
+                                </a:prstGeom>
+                              </pic:spPr>
+                            </pic:pic>
+                          </a:graphicData>
+                        </a:graphic>
+                      </wp:inline>
+                    </w:drawing>
+                  </w:r>
+                  <w:r>
                     <w:rPr>
                       <w:rFonts w:ascii="Amiri" w:cs="Amiri" w:eastAsia="Amiri" w:hAnsi="Amiri"/>
-                      <w:color w:val="808080"/>
-                      <w:sz w:val="32"/>
-                      <w:szCs w:val="32"/>
-                      <w:rtl/>
-                    </w:rPr>
-                    <w:t xml:space="preserve">............</w:t>
-                  </w:r>
-                  <w:r>
-                    <w:rPr>
-                      <w:rFonts w:ascii="Amiri" w:cs="Amiri" w:eastAsia="Amiri" w:hAnsi="Amiri"/>
+                      <w:position w:val="15"/>
                       <w:sz w:val="42"/>
                       <w:szCs w:val="42"/>
                       <w:rtl/>
@@ -4146,35 +4682,48 @@
           <w:p>
             <w:pPr>
               <w:bidi/>
-              <w:spacing w:after="60" w:before="40" w:line="300" w:lineRule="auto"/>
+              <w:spacing w:after="20" w:before="60" w:line="240" w:lineRule="auto"/>
               <w:jc w:val="center"/>
             </w:pPr>
             <w:r>
-              <w:rPr>
-                <w:rFonts w:ascii="Amiri" w:cs="Amiri" w:eastAsia="Amiri" w:hAnsi="Amiri"/>
-                <w:color w:val="808080"/>
-                <w:sz w:val="32"/>
-                <w:szCs w:val="32"/>
-                <w:rtl/>
-              </w:rPr>
-              <w:t xml:space="preserve">....................................................................................................</w:t>
-            </w:r>
-          </w:p>
-          <w:p>
-            <w:pPr>
-              <w:bidi/>
-              <w:spacing w:after="0" w:before="60" w:line="300" w:lineRule="auto"/>
-              <w:jc w:val="center"/>
-            </w:pPr>
-            <w:r>
-              <w:rPr>
-                <w:rFonts w:ascii="Amiri" w:cs="Amiri" w:eastAsia="Amiri" w:hAnsi="Amiri"/>
-                <w:color w:val="808080"/>
-                <w:sz w:val="32"/>
-                <w:szCs w:val="32"/>
-                <w:rtl/>
-              </w:rPr>
-              <w:t xml:space="preserve">....................................................................................................</w:t>
+              <w:drawing>
+                <wp:inline distT="0" distB="0" distL="0" distR="0">
+                  <wp:extent cx="5943600" cy="466725"/>
+                  <wp:effectExtent t="0" r="0" b="0" l="0"/>
+                  <wp:docPr id="1" name="" descr="" title=""/>
+                  <wp:cNvGraphicFramePr>
+                    <a:graphicFrameLocks xmlns:a="http://schemas.openxmlformats.org/drawingml/2006/main" noChangeAspect="1"/>
+                  </wp:cNvGraphicFramePr>
+                  <a:graphic xmlns:a="http://schemas.openxmlformats.org/drawingml/2006/main">
+                    <a:graphicData uri="http://schemas.openxmlformats.org/drawingml/2006/picture">
+                      <pic:pic xmlns:pic="http://schemas.openxmlformats.org/drawingml/2006/picture">
+                        <pic:nvPicPr>
+                          <pic:cNvPr id="0" name="" descr=""/>
+                          <pic:cNvPicPr>
+                            <a:picLocks noChangeAspect="1" noChangeArrowheads="1"/>
+                          </pic:cNvPicPr>
+                        </pic:nvPicPr>
+                        <pic:blipFill>
+                          <a:blip r:embed="rId16" cstate="none"/>
+                          <a:srcRect/>
+                          <a:stretch>
+                            <a:fillRect/>
+                          </a:stretch>
+                        </pic:blipFill>
+                        <pic:spPr bwMode="auto">
+                          <a:xfrm>
+                            <a:off x="0" y="0"/>
+                            <a:ext cx="5943600" cy="466725"/>
+                          </a:xfrm>
+                          <a:prstGeom prst="rect">
+                            <a:avLst/>
+                          </a:prstGeom>
+                        </pic:spPr>
+                      </pic:pic>
+                    </a:graphicData>
+                  </a:graphic>
+                </wp:inline>
+              </w:drawing>
             </w:r>
           </w:p>
         </w:tc>

</xml_diff>

<commit_message>
Use Seyes-style copybook ruling in answer boxes
Each box now has a thick main line with three thin lines above and three
below (eight equal gaps) and vertical cell lines, like school copybooks.
Printed words beside the boxes sit on the main line.

Co-Authored-By: Claude Opus 5.5 <noreply@anthropic.com>
Claude-Session: https://claude.ai/code/session_01GpmMkoJqENNuTTU6MYzvCq
</commit_message>
<xml_diff>
--- a/arabic-worksheets/مرحلة-التركيب-الميم-الراء.docx
+++ b/arabic-worksheets/مرحلة-التركيب-الميم-الراء.docx
@@ -450,12 +450,12 @@
           <w:p>
             <w:pPr>
               <w:bidi/>
-              <w:spacing w:after="40" w:before="160" w:line="300" w:lineRule="auto"/>
+              <w:spacing w:after="40" w:before="160" w:line="250" w:lineRule="auto"/>
             </w:pPr>
             <w:r>
               <w:rPr>
                 <w:rFonts w:ascii="Amiri" w:cs="Amiri" w:eastAsia="Amiri" w:hAnsi="Amiri"/>
-                <w:position w:val="15"/>
+                <w:position w:val="24"/>
                 <w:sz w:val="44"/>
                 <w:szCs w:val="44"/>
                 <w:rtl/>
@@ -465,7 +465,7 @@
             <w:r>
               <w:drawing>
                 <wp:inline distT="0" distB="0" distL="0" distR="0">
-                  <wp:extent cx="723900" cy="400050"/>
+                  <wp:extent cx="609600" cy="609600"/>
                   <wp:effectExtent t="0" r="0" b="0" l="0"/>
                   <wp:docPr id="1" name="" descr="" title=""/>
                   <wp:cNvGraphicFramePr>
@@ -490,7 +490,7 @@
                         <pic:spPr bwMode="auto">
                           <a:xfrm>
                             <a:off x="0" y="0"/>
-                            <a:ext cx="723900" cy="400050"/>
+                            <a:ext cx="609600" cy="609600"/>
                           </a:xfrm>
                           <a:prstGeom prst="rect">
                             <a:avLst/>
@@ -505,7 +505,7 @@
             <w:r>
               <w:rPr>
                 <w:rFonts w:ascii="Amiri" w:cs="Amiri" w:eastAsia="Amiri" w:hAnsi="Amiri"/>
-                <w:position w:val="15"/>
+                <w:position w:val="24"/>
                 <w:sz w:val="44"/>
                 <w:szCs w:val="44"/>
                 <w:rtl/>
@@ -515,7 +515,7 @@
             <w:r>
               <w:drawing>
                 <wp:inline distT="0" distB="0" distL="0" distR="0">
-                  <wp:extent cx="723900" cy="400050"/>
+                  <wp:extent cx="609600" cy="609600"/>
                   <wp:effectExtent t="0" r="0" b="0" l="0"/>
                   <wp:docPr id="1" name="" descr="" title=""/>
                   <wp:cNvGraphicFramePr>
@@ -540,7 +540,7 @@
                         <pic:spPr bwMode="auto">
                           <a:xfrm>
                             <a:off x="0" y="0"/>
-                            <a:ext cx="723900" cy="400050"/>
+                            <a:ext cx="609600" cy="609600"/>
                           </a:xfrm>
                           <a:prstGeom prst="rect">
                             <a:avLst/>
@@ -555,7 +555,7 @@
             <w:r>
               <w:rPr>
                 <w:rFonts w:ascii="Amiri" w:cs="Amiri" w:eastAsia="Amiri" w:hAnsi="Amiri"/>
-                <w:position w:val="15"/>
+                <w:position w:val="24"/>
                 <w:sz w:val="44"/>
                 <w:szCs w:val="44"/>
                 <w:rtl/>
@@ -565,7 +565,7 @@
             <w:r>
               <w:drawing>
                 <wp:inline distT="0" distB="0" distL="0" distR="0">
-                  <wp:extent cx="723900" cy="400050"/>
+                  <wp:extent cx="609600" cy="609600"/>
                   <wp:effectExtent t="0" r="0" b="0" l="0"/>
                   <wp:docPr id="1" name="" descr="" title=""/>
                   <wp:cNvGraphicFramePr>
@@ -590,7 +590,7 @@
                         <pic:spPr bwMode="auto">
                           <a:xfrm>
                             <a:off x="0" y="0"/>
-                            <a:ext cx="723900" cy="400050"/>
+                            <a:ext cx="609600" cy="609600"/>
                           </a:xfrm>
                           <a:prstGeom prst="rect">
                             <a:avLst/>
@@ -605,7 +605,7 @@
             <w:r>
               <w:rPr>
                 <w:rFonts w:ascii="Amiri" w:cs="Amiri" w:eastAsia="Amiri" w:hAnsi="Amiri"/>
-                <w:position w:val="15"/>
+                <w:position w:val="24"/>
                 <w:sz w:val="44"/>
                 <w:szCs w:val="44"/>
                 <w:rtl/>
@@ -615,7 +615,7 @@
             <w:r>
               <w:drawing>
                 <wp:inline distT="0" distB="0" distL="0" distR="0">
-                  <wp:extent cx="723900" cy="400050"/>
+                  <wp:extent cx="609600" cy="609600"/>
                   <wp:effectExtent t="0" r="0" b="0" l="0"/>
                   <wp:docPr id="1" name="" descr="" title=""/>
                   <wp:cNvGraphicFramePr>
@@ -640,7 +640,7 @@
                         <pic:spPr bwMode="auto">
                           <a:xfrm>
                             <a:off x="0" y="0"/>
-                            <a:ext cx="723900" cy="400050"/>
+                            <a:ext cx="609600" cy="609600"/>
                           </a:xfrm>
                           <a:prstGeom prst="rect">
                             <a:avLst/>
@@ -655,7 +655,7 @@
             <w:r>
               <w:rPr>
                 <w:rFonts w:ascii="Amiri" w:cs="Amiri" w:eastAsia="Amiri" w:hAnsi="Amiri"/>
-                <w:position w:val="15"/>
+                <w:position w:val="24"/>
                 <w:sz w:val="44"/>
                 <w:szCs w:val="44"/>
                 <w:rtl/>
@@ -666,12 +666,12 @@
           <w:p>
             <w:pPr>
               <w:bidi/>
-              <w:spacing w:after="20" w:before="40" w:line="300" w:lineRule="auto"/>
+              <w:spacing w:after="20" w:before="60" w:line="250" w:lineRule="auto"/>
             </w:pPr>
             <w:r>
               <w:rPr>
                 <w:rFonts w:ascii="Amiri" w:cs="Amiri" w:eastAsia="Amiri" w:hAnsi="Amiri"/>
-                <w:position w:val="15"/>
+                <w:position w:val="24"/>
                 <w:sz w:val="44"/>
                 <w:szCs w:val="44"/>
                 <w:rtl/>
@@ -681,7 +681,7 @@
             <w:r>
               <w:drawing>
                 <wp:inline distT="0" distB="0" distL="0" distR="0">
-                  <wp:extent cx="723900" cy="400050"/>
+                  <wp:extent cx="609600" cy="609600"/>
                   <wp:effectExtent t="0" r="0" b="0" l="0"/>
                   <wp:docPr id="1" name="" descr="" title=""/>
                   <wp:cNvGraphicFramePr>
@@ -706,7 +706,7 @@
                         <pic:spPr bwMode="auto">
                           <a:xfrm>
                             <a:off x="0" y="0"/>
-                            <a:ext cx="723900" cy="400050"/>
+                            <a:ext cx="609600" cy="609600"/>
                           </a:xfrm>
                           <a:prstGeom prst="rect">
                             <a:avLst/>
@@ -721,7 +721,7 @@
             <w:r>
               <w:rPr>
                 <w:rFonts w:ascii="Amiri" w:cs="Amiri" w:eastAsia="Amiri" w:hAnsi="Amiri"/>
-                <w:position w:val="15"/>
+                <w:position w:val="24"/>
                 <w:sz w:val="44"/>
                 <w:szCs w:val="44"/>
                 <w:rtl/>
@@ -3202,7 +3202,7 @@
           </w:tbl>
           <w:p>
             <w:pPr>
-              <w:spacing w:after="0" w:before="0" w:line="180" w:lineRule="exact"/>
+              <w:spacing w:after="0" w:before="0" w:line="100" w:lineRule="exact"/>
             </w:pPr>
           </w:p>
           <w:tbl>
@@ -3251,13 +3251,13 @@
                 <w:p>
                   <w:pPr>
                     <w:bidi/>
-                    <w:spacing w:after="20" w:before="20" w:line="320" w:lineRule="auto"/>
+                    <w:spacing w:after="0" w:before="0" w:line="250" w:lineRule="auto"/>
                     <w:jc w:val="center"/>
                   </w:pPr>
                   <w:r>
                     <w:drawing>
                       <wp:inline distT="0" distB="0" distL="0" distR="0">
-                        <wp:extent cx="723900" cy="400050"/>
+                        <wp:extent cx="609600" cy="609600"/>
                         <wp:effectExtent t="0" r="0" b="0" l="0"/>
                         <wp:docPr id="1" name="" descr="" title=""/>
                         <wp:cNvGraphicFramePr>
@@ -3282,7 +3282,7 @@
                               <pic:spPr bwMode="auto">
                                 <a:xfrm>
                                   <a:off x="0" y="0"/>
-                                  <a:ext cx="723900" cy="400050"/>
+                                  <a:ext cx="609600" cy="609600"/>
                                 </a:xfrm>
                                 <a:prstGeom prst="rect">
                                   <a:avLst/>
@@ -3297,7 +3297,7 @@
                   <w:r>
                     <w:rPr>
                       <w:rFonts w:ascii="Amiri" w:cs="Amiri" w:eastAsia="Amiri" w:hAnsi="Amiri"/>
-                      <w:position w:val="15"/>
+                      <w:position w:val="24"/>
                       <w:sz w:val="42"/>
                       <w:szCs w:val="42"/>
                       <w:rtl/>
@@ -3351,13 +3351,13 @@
                 <w:p>
                   <w:pPr>
                     <w:bidi/>
-                    <w:spacing w:after="20" w:before="20" w:line="320" w:lineRule="auto"/>
+                    <w:spacing w:after="0" w:before="0" w:line="250" w:lineRule="auto"/>
                     <w:jc w:val="center"/>
                   </w:pPr>
                   <w:r>
                     <w:rPr>
                       <w:rFonts w:ascii="Amiri" w:cs="Amiri" w:eastAsia="Amiri" w:hAnsi="Amiri"/>
-                      <w:position w:val="15"/>
+                      <w:position w:val="24"/>
                       <w:sz w:val="42"/>
                       <w:szCs w:val="42"/>
                       <w:rtl/>
@@ -3367,7 +3367,7 @@
                   <w:r>
                     <w:drawing>
                       <wp:inline distT="0" distB="0" distL="0" distR="0">
-                        <wp:extent cx="723900" cy="400050"/>
+                        <wp:extent cx="609600" cy="609600"/>
                         <wp:effectExtent t="0" r="0" b="0" l="0"/>
                         <wp:docPr id="1" name="" descr="" title=""/>
                         <wp:cNvGraphicFramePr>
@@ -3392,7 +3392,7 @@
                               <pic:spPr bwMode="auto">
                                 <a:xfrm>
                                   <a:off x="0" y="0"/>
-                                  <a:ext cx="723900" cy="400050"/>
+                                  <a:ext cx="609600" cy="609600"/>
                                 </a:xfrm>
                                 <a:prstGeom prst="rect">
                                   <a:avLst/>
@@ -3407,7 +3407,7 @@
                   <w:r>
                     <w:rPr>
                       <w:rFonts w:ascii="Amiri" w:cs="Amiri" w:eastAsia="Amiri" w:hAnsi="Amiri"/>
-                      <w:position w:val="15"/>
+                      <w:position w:val="24"/>
                       <w:sz w:val="42"/>
                       <w:szCs w:val="42"/>
                       <w:rtl/>
@@ -3461,13 +3461,13 @@
                 <w:p>
                   <w:pPr>
                     <w:bidi/>
-                    <w:spacing w:after="20" w:before="20" w:line="320" w:lineRule="auto"/>
+                    <w:spacing w:after="0" w:before="0" w:line="250" w:lineRule="auto"/>
                     <w:jc w:val="center"/>
                   </w:pPr>
                   <w:r>
                     <w:rPr>
                       <w:rFonts w:ascii="Amiri" w:cs="Amiri" w:eastAsia="Amiri" w:hAnsi="Amiri"/>
-                      <w:position w:val="15"/>
+                      <w:position w:val="24"/>
                       <w:sz w:val="42"/>
                       <w:szCs w:val="42"/>
                       <w:rtl/>
@@ -3477,7 +3477,7 @@
                   <w:r>
                     <w:drawing>
                       <wp:inline distT="0" distB="0" distL="0" distR="0">
-                        <wp:extent cx="723900" cy="400050"/>
+                        <wp:extent cx="609600" cy="609600"/>
                         <wp:effectExtent t="0" r="0" b="0" l="0"/>
                         <wp:docPr id="1" name="" descr="" title=""/>
                         <wp:cNvGraphicFramePr>
@@ -3502,7 +3502,7 @@
                               <pic:spPr bwMode="auto">
                                 <a:xfrm>
                                   <a:off x="0" y="0"/>
-                                  <a:ext cx="723900" cy="400050"/>
+                                  <a:ext cx="609600" cy="609600"/>
                                 </a:xfrm>
                                 <a:prstGeom prst="rect">
                                   <a:avLst/>
@@ -3517,7 +3517,7 @@
                   <w:r>
                     <w:rPr>
                       <w:rFonts w:ascii="Amiri" w:cs="Amiri" w:eastAsia="Amiri" w:hAnsi="Amiri"/>
-                      <w:position w:val="15"/>
+                      <w:position w:val="24"/>
                       <w:sz w:val="42"/>
                       <w:szCs w:val="42"/>
                       <w:rtl/>
@@ -3571,13 +3571,13 @@
                 <w:p>
                   <w:pPr>
                     <w:bidi/>
-                    <w:spacing w:after="20" w:before="20" w:line="320" w:lineRule="auto"/>
+                    <w:spacing w:after="0" w:before="0" w:line="250" w:lineRule="auto"/>
                     <w:jc w:val="center"/>
                   </w:pPr>
                   <w:r>
                     <w:rPr>
                       <w:rFonts w:ascii="Amiri" w:cs="Amiri" w:eastAsia="Amiri" w:hAnsi="Amiri"/>
-                      <w:position w:val="15"/>
+                      <w:position w:val="24"/>
                       <w:sz w:val="42"/>
                       <w:szCs w:val="42"/>
                       <w:rtl/>
@@ -3587,7 +3587,7 @@
                   <w:r>
                     <w:drawing>
                       <wp:inline distT="0" distB="0" distL="0" distR="0">
-                        <wp:extent cx="723900" cy="400050"/>
+                        <wp:extent cx="609600" cy="609600"/>
                         <wp:effectExtent t="0" r="0" b="0" l="0"/>
                         <wp:docPr id="1" name="" descr="" title=""/>
                         <wp:cNvGraphicFramePr>
@@ -3612,7 +3612,7 @@
                               <pic:spPr bwMode="auto">
                                 <a:xfrm>
                                   <a:off x="0" y="0"/>
-                                  <a:ext cx="723900" cy="400050"/>
+                                  <a:ext cx="609600" cy="609600"/>
                                 </a:xfrm>
                                 <a:prstGeom prst="rect">
                                   <a:avLst/>
@@ -3627,7 +3627,7 @@
                   <w:r>
                     <w:rPr>
                       <w:rFonts w:ascii="Amiri" w:cs="Amiri" w:eastAsia="Amiri" w:hAnsi="Amiri"/>
-                      <w:position w:val="15"/>
+                      <w:position w:val="24"/>
                       <w:sz w:val="42"/>
                       <w:szCs w:val="42"/>
                       <w:rtl/>
@@ -3721,12 +3721,12 @@
           <w:p>
             <w:pPr>
               <w:bidi/>
-              <w:spacing w:after="0" w:before="0" w:line="320" w:lineRule="auto"/>
+              <w:spacing w:after="0" w:before="0" w:line="250" w:lineRule="auto"/>
             </w:pPr>
             <w:r>
               <w:rPr>
                 <w:rFonts w:ascii="Amiri" w:cs="Amiri" w:eastAsia="Amiri" w:hAnsi="Amiri"/>
-                <w:position w:val="15"/>
+                <w:position w:val="24"/>
                 <w:sz w:val="42"/>
                 <w:szCs w:val="42"/>
                 <w:rtl/>
@@ -3736,7 +3736,7 @@
             <w:r>
               <w:drawing>
                 <wp:inline distT="0" distB="0" distL="0" distR="0">
-                  <wp:extent cx="1219200" cy="400050"/>
+                  <wp:extent cx="1514475" cy="609600"/>
                   <wp:effectExtent t="0" r="0" b="0" l="0"/>
                   <wp:docPr id="1" name="" descr="" title=""/>
                   <wp:cNvGraphicFramePr>
@@ -3761,7 +3761,7 @@
                         <pic:spPr bwMode="auto">
                           <a:xfrm>
                             <a:off x="0" y="0"/>
-                            <a:ext cx="1219200" cy="400050"/>
+                            <a:ext cx="1514475" cy="609600"/>
                           </a:xfrm>
                           <a:prstGeom prst="rect">
                             <a:avLst/>
@@ -3776,7 +3776,7 @@
             <w:r>
               <w:rPr>
                 <w:rFonts w:ascii="Amiri" w:cs="Amiri" w:eastAsia="Amiri" w:hAnsi="Amiri"/>
-                <w:position w:val="15"/>
+                <w:position w:val="24"/>
                 <w:sz w:val="42"/>
                 <w:szCs w:val="42"/>
                 <w:rtl/>
@@ -3786,7 +3786,7 @@
             <w:r>
               <w:drawing>
                 <wp:inline distT="0" distB="0" distL="0" distR="0">
-                  <wp:extent cx="1219200" cy="400050"/>
+                  <wp:extent cx="1514475" cy="609600"/>
                   <wp:effectExtent t="0" r="0" b="0" l="0"/>
                   <wp:docPr id="1" name="" descr="" title=""/>
                   <wp:cNvGraphicFramePr>
@@ -3811,7 +3811,7 @@
                         <pic:spPr bwMode="auto">
                           <a:xfrm>
                             <a:off x="0" y="0"/>
-                            <a:ext cx="1219200" cy="400050"/>
+                            <a:ext cx="1514475" cy="609600"/>
                           </a:xfrm>
                           <a:prstGeom prst="rect">
                             <a:avLst/>
@@ -3826,7 +3826,7 @@
             <w:r>
               <w:rPr>
                 <w:rFonts w:ascii="Amiri" w:cs="Amiri" w:eastAsia="Amiri" w:hAnsi="Amiri"/>
-                <w:position w:val="15"/>
+                <w:position w:val="24"/>
                 <w:sz w:val="42"/>
                 <w:szCs w:val="42"/>
                 <w:rtl/>
@@ -3836,7 +3836,7 @@
             <w:r>
               <w:drawing>
                 <wp:inline distT="0" distB="0" distL="0" distR="0">
-                  <wp:extent cx="1219200" cy="400050"/>
+                  <wp:extent cx="1514475" cy="609600"/>
                   <wp:effectExtent t="0" r="0" b="0" l="0"/>
                   <wp:docPr id="1" name="" descr="" title=""/>
                   <wp:cNvGraphicFramePr>
@@ -3861,7 +3861,7 @@
                         <pic:spPr bwMode="auto">
                           <a:xfrm>
                             <a:off x="0" y="0"/>
-                            <a:ext cx="1219200" cy="400050"/>
+                            <a:ext cx="1514475" cy="609600"/>
                           </a:xfrm>
                           <a:prstGeom prst="rect">
                             <a:avLst/>
@@ -3877,12 +3877,12 @@
           <w:p>
             <w:pPr>
               <w:bidi/>
-              <w:spacing w:after="0" w:before="20" w:line="320" w:lineRule="auto"/>
+              <w:spacing w:after="0" w:before="40" w:line="250" w:lineRule="auto"/>
             </w:pPr>
             <w:r>
               <w:rPr>
                 <w:rFonts w:ascii="Amiri" w:cs="Amiri" w:eastAsia="Amiri" w:hAnsi="Amiri"/>
-                <w:position w:val="15"/>
+                <w:position w:val="24"/>
                 <w:sz w:val="42"/>
                 <w:szCs w:val="42"/>
                 <w:rtl/>
@@ -3892,7 +3892,7 @@
             <w:r>
               <w:drawing>
                 <wp:inline distT="0" distB="0" distL="0" distR="0">
-                  <wp:extent cx="1219200" cy="400050"/>
+                  <wp:extent cx="1514475" cy="609600"/>
                   <wp:effectExtent t="0" r="0" b="0" l="0"/>
                   <wp:docPr id="1" name="" descr="" title=""/>
                   <wp:cNvGraphicFramePr>
@@ -3917,7 +3917,7 @@
                         <pic:spPr bwMode="auto">
                           <a:xfrm>
                             <a:off x="0" y="0"/>
-                            <a:ext cx="1219200" cy="400050"/>
+                            <a:ext cx="1514475" cy="609600"/>
                           </a:xfrm>
                           <a:prstGeom prst="rect">
                             <a:avLst/>
@@ -3932,7 +3932,7 @@
             <w:r>
               <w:rPr>
                 <w:rFonts w:ascii="Amiri" w:cs="Amiri" w:eastAsia="Amiri" w:hAnsi="Amiri"/>
-                <w:position w:val="15"/>
+                <w:position w:val="24"/>
                 <w:sz w:val="42"/>
                 <w:szCs w:val="42"/>
                 <w:rtl/>
@@ -4073,7 +4073,7 @@
                   <w:r>
                     <w:drawing>
                       <wp:inline distT="0" distB="0" distL="0" distR="0">
-                        <wp:extent cx="1000125" cy="666750"/>
+                        <wp:extent cx="857250" cy="571500"/>
                         <wp:effectExtent t="0" r="0" b="0" l="0"/>
                         <wp:docPr id="1" name="" descr="" title=""/>
                         <wp:cNvGraphicFramePr>
@@ -4098,7 +4098,7 @@
                               <pic:spPr bwMode="auto">
                                 <a:xfrm>
                                   <a:off x="0" y="0"/>
-                                  <a:ext cx="1000125" cy="666750"/>
+                                  <a:ext cx="857250" cy="571500"/>
                                 </a:xfrm>
                                 <a:prstGeom prst="rect">
                                   <a:avLst/>
@@ -4114,13 +4114,13 @@
                 <w:p>
                   <w:pPr>
                     <w:bidi/>
-                    <w:spacing w:after="40" w:before="40" w:line="340" w:lineRule="auto"/>
+                    <w:spacing w:after="40" w:before="40" w:line="250" w:lineRule="auto"/>
                     <w:jc w:val="center"/>
                   </w:pPr>
                   <w:r>
                     <w:rPr>
                       <w:rFonts w:ascii="Amiri" w:cs="Amiri" w:eastAsia="Amiri" w:hAnsi="Amiri"/>
-                      <w:position w:val="15"/>
+                      <w:position w:val="24"/>
                       <w:sz w:val="42"/>
                       <w:szCs w:val="42"/>
                       <w:rtl/>
@@ -4130,7 +4130,7 @@
                   <w:r>
                     <w:drawing>
                       <wp:inline distT="0" distB="0" distL="0" distR="0">
-                        <wp:extent cx="723900" cy="400050"/>
+                        <wp:extent cx="609600" cy="609600"/>
                         <wp:effectExtent t="0" r="0" b="0" l="0"/>
                         <wp:docPr id="1" name="" descr="" title=""/>
                         <wp:cNvGraphicFramePr>
@@ -4155,7 +4155,7 @@
                               <pic:spPr bwMode="auto">
                                 <a:xfrm>
                                   <a:off x="0" y="0"/>
-                                  <a:ext cx="723900" cy="400050"/>
+                                  <a:ext cx="609600" cy="609600"/>
                                 </a:xfrm>
                                 <a:prstGeom prst="rect">
                                   <a:avLst/>
@@ -4170,7 +4170,7 @@
                   <w:r>
                     <w:rPr>
                       <w:rFonts w:ascii="Amiri" w:cs="Amiri" w:eastAsia="Amiri" w:hAnsi="Amiri"/>
-                      <w:position w:val="15"/>
+                      <w:position w:val="24"/>
                       <w:sz w:val="42"/>
                       <w:szCs w:val="42"/>
                       <w:rtl/>
@@ -4230,13 +4230,13 @@
                 <w:p>
                   <w:pPr>
                     <w:bidi/>
-                    <w:spacing w:after="40" w:before="40" w:line="340" w:lineRule="auto"/>
+                    <w:spacing w:after="40" w:before="40" w:line="250" w:lineRule="auto"/>
                     <w:jc w:val="center"/>
                   </w:pPr>
                   <w:r>
                     <w:rPr>
                       <w:rFonts w:ascii="Amiri" w:cs="Amiri" w:eastAsia="Amiri" w:hAnsi="Amiri"/>
-                      <w:position w:val="15"/>
+                      <w:position w:val="24"/>
                       <w:sz w:val="42"/>
                       <w:szCs w:val="42"/>
                       <w:rtl/>
@@ -4246,7 +4246,7 @@
                   <w:r>
                     <w:drawing>
                       <wp:inline distT="0" distB="0" distL="0" distR="0">
-                        <wp:extent cx="723900" cy="400050"/>
+                        <wp:extent cx="609600" cy="609600"/>
                         <wp:effectExtent t="0" r="0" b="0" l="0"/>
                         <wp:docPr id="1" name="" descr="" title=""/>
                         <wp:cNvGraphicFramePr>
@@ -4271,7 +4271,7 @@
                               <pic:spPr bwMode="auto">
                                 <a:xfrm>
                                   <a:off x="0" y="0"/>
-                                  <a:ext cx="723900" cy="400050"/>
+                                  <a:ext cx="609600" cy="609600"/>
                                 </a:xfrm>
                                 <a:prstGeom prst="rect">
                                   <a:avLst/>
@@ -4335,7 +4335,7 @@
                   <w:r>
                     <w:drawing>
                       <wp:inline distT="0" distB="0" distL="0" distR="0">
-                        <wp:extent cx="514350" cy="666750"/>
+                        <wp:extent cx="438150" cy="571500"/>
                         <wp:effectExtent t="0" r="0" b="0" l="0"/>
                         <wp:docPr id="1" name="" descr="" title=""/>
                         <wp:cNvGraphicFramePr>
@@ -4360,7 +4360,7 @@
                               <pic:spPr bwMode="auto">
                                 <a:xfrm>
                                   <a:off x="0" y="0"/>
-                                  <a:ext cx="514350" cy="666750"/>
+                                  <a:ext cx="438150" cy="571500"/>
                                 </a:xfrm>
                                 <a:prstGeom prst="rect">
                                   <a:avLst/>
@@ -4376,13 +4376,13 @@
                 <w:p>
                   <w:pPr>
                     <w:bidi/>
-                    <w:spacing w:after="40" w:before="40" w:line="340" w:lineRule="auto"/>
+                    <w:spacing w:after="40" w:before="40" w:line="250" w:lineRule="auto"/>
                     <w:jc w:val="center"/>
                   </w:pPr>
                   <w:r>
                     <w:rPr>
                       <w:rFonts w:ascii="Amiri" w:cs="Amiri" w:eastAsia="Amiri" w:hAnsi="Amiri"/>
-                      <w:position w:val="15"/>
+                      <w:position w:val="24"/>
                       <w:sz w:val="42"/>
                       <w:szCs w:val="42"/>
                       <w:rtl/>
@@ -4392,7 +4392,7 @@
                   <w:r>
                     <w:drawing>
                       <wp:inline distT="0" distB="0" distL="0" distR="0">
-                        <wp:extent cx="723900" cy="400050"/>
+                        <wp:extent cx="609600" cy="609600"/>
                         <wp:effectExtent t="0" r="0" b="0" l="0"/>
                         <wp:docPr id="1" name="" descr="" title=""/>
                         <wp:cNvGraphicFramePr>
@@ -4417,7 +4417,7 @@
                               <pic:spPr bwMode="auto">
                                 <a:xfrm>
                                   <a:off x="0" y="0"/>
-                                  <a:ext cx="723900" cy="400050"/>
+                                  <a:ext cx="609600" cy="609600"/>
                                 </a:xfrm>
                                 <a:prstGeom prst="rect">
                                   <a:avLst/>
@@ -4432,7 +4432,7 @@
                   <w:r>
                     <w:rPr>
                       <w:rFonts w:ascii="Amiri" w:cs="Amiri" w:eastAsia="Amiri" w:hAnsi="Amiri"/>
-                      <w:position w:val="15"/>
+                      <w:position w:val="24"/>
                       <w:sz w:val="42"/>
                       <w:szCs w:val="42"/>
                       <w:rtl/>
@@ -4491,7 +4491,7 @@
                   <w:r>
                     <w:drawing>
                       <wp:inline distT="0" distB="0" distL="0" distR="0">
-                        <wp:extent cx="1000125" cy="666750"/>
+                        <wp:extent cx="857250" cy="571500"/>
                         <wp:effectExtent t="0" r="0" b="0" l="0"/>
                         <wp:docPr id="1" name="" descr="" title=""/>
                         <wp:cNvGraphicFramePr>
@@ -4516,7 +4516,7 @@
                               <pic:spPr bwMode="auto">
                                 <a:xfrm>
                                   <a:off x="0" y="0"/>
-                                  <a:ext cx="1000125" cy="666750"/>
+                                  <a:ext cx="857250" cy="571500"/>
                                 </a:xfrm>
                                 <a:prstGeom prst="rect">
                                   <a:avLst/>
@@ -4532,13 +4532,13 @@
                 <w:p>
                   <w:pPr>
                     <w:bidi/>
-                    <w:spacing w:after="40" w:before="40" w:line="340" w:lineRule="auto"/>
+                    <w:spacing w:after="40" w:before="40" w:line="250" w:lineRule="auto"/>
                     <w:jc w:val="center"/>
                   </w:pPr>
                   <w:r>
                     <w:rPr>
                       <w:rFonts w:ascii="Amiri" w:cs="Amiri" w:eastAsia="Amiri" w:hAnsi="Amiri"/>
-                      <w:position w:val="15"/>
+                      <w:position w:val="24"/>
                       <w:sz w:val="42"/>
                       <w:szCs w:val="42"/>
                       <w:rtl/>
@@ -4548,7 +4548,7 @@
                   <w:r>
                     <w:drawing>
                       <wp:inline distT="0" distB="0" distL="0" distR="0">
-                        <wp:extent cx="723900" cy="400050"/>
+                        <wp:extent cx="609600" cy="609600"/>
                         <wp:effectExtent t="0" r="0" b="0" l="0"/>
                         <wp:docPr id="1" name="" descr="" title=""/>
                         <wp:cNvGraphicFramePr>
@@ -4573,7 +4573,7 @@
                               <pic:spPr bwMode="auto">
                                 <a:xfrm>
                                   <a:off x="0" y="0"/>
-                                  <a:ext cx="723900" cy="400050"/>
+                                  <a:ext cx="609600" cy="609600"/>
                                 </a:xfrm>
                                 <a:prstGeom prst="rect">
                                   <a:avLst/>
@@ -4588,7 +4588,7 @@
                   <w:r>
                     <w:rPr>
                       <w:rFonts w:ascii="Amiri" w:cs="Amiri" w:eastAsia="Amiri" w:hAnsi="Amiri"/>
-                      <w:position w:val="15"/>
+                      <w:position w:val="24"/>
                       <w:sz w:val="42"/>
                       <w:szCs w:val="42"/>
                       <w:rtl/>
@@ -4688,7 +4688,7 @@
             <w:r>
               <w:drawing>
                 <wp:inline distT="0" distB="0" distL="0" distR="0">
-                  <wp:extent cx="5943600" cy="466725"/>
+                  <wp:extent cx="6048375" cy="609600"/>
                   <wp:effectExtent t="0" r="0" b="0" l="0"/>
                   <wp:docPr id="1" name="" descr="" title=""/>
                   <wp:cNvGraphicFramePr>
@@ -4713,7 +4713,7 @@
                         <pic:spPr bwMode="auto">
                           <a:xfrm>
                             <a:off x="0" y="0"/>
-                            <a:ext cx="5943600" cy="466725"/>
+                            <a:ext cx="6048375" cy="609600"/>
                           </a:xfrm>
                           <a:prstGeom prst="rect">
                             <a:avLst/>

</xml_diff>